<commit_message>
feat: add ICP备案 footer + deploy to 39.97.162.160:3002 + fix nginx config
- Footer: add ICP备案 placeholder (needs real number)
- Server: deploy new code to port 3002 via PM2
- Nginx: remove old static 'epr' config, fix 'freddy-epr' proxy to 3002
- Add freddy-epr-deploy.tar.gz to .gitignore
- PM2 auto-start enabled

Co-Authored-By: Claude <noreply@anthropic.com>
</commit_message>
<xml_diff>
--- a/projects/contracts/LIVANTO/Bevollmächtigungsvertrag_03.docx
+++ b/projects/contracts/LIVANTO/Bevollmächtigungsvertrag_03.docx
@@ -72,7 +72,7 @@
     </w:p>
     <w:tbl>
       <w:tblPr>
-        <w:tblStyle w:val="11"/>
+        <w:tblStyle w:val="12"/>
         <w:tblW w:w="9705" w:type="dxa"/>
         <w:tblInd w:w="0" w:type="dxa"/>
         <w:tblBorders>
@@ -92,8 +92,8 @@
         </w:tblCellMar>
       </w:tblPr>
       <w:tblGrid>
-        <w:gridCol w:w="4513"/>
-        <w:gridCol w:w="5192"/>
+        <w:gridCol w:w="5018"/>
+        <w:gridCol w:w="4687"/>
       </w:tblGrid>
       <w:tr>
         <w:tblPrEx>
@@ -114,7 +114,7 @@
         </w:tblPrEx>
         <w:tc>
           <w:tcPr>
-            <w:tcW w:w="4513" w:type="dxa"/>
+            <w:tcW w:w="5018" w:type="dxa"/>
             <w:tcBorders>
               <w:top w:val="nil"/>
               <w:left w:val="nil"/>
@@ -146,7 +146,7 @@
         </w:tc>
         <w:tc>
           <w:tcPr>
-            <w:tcW w:w="5192" w:type="dxa"/>
+            <w:tcW w:w="4687" w:type="dxa"/>
             <w:tcBorders>
               <w:top w:val="nil"/>
               <w:left w:val="nil"/>
@@ -196,7 +196,7 @@
         </w:tblPrEx>
         <w:tc>
           <w:tcPr>
-            <w:tcW w:w="4513" w:type="dxa"/>
+            <w:tcW w:w="5018" w:type="dxa"/>
             <w:tcBorders>
               <w:top w:val="nil"/>
               <w:left w:val="nil"/>
@@ -228,7 +228,7 @@
         </w:tc>
         <w:tc>
           <w:tcPr>
-            <w:tcW w:w="5192" w:type="dxa"/>
+            <w:tcW w:w="4687" w:type="dxa"/>
             <w:tcBorders>
               <w:top w:val="nil"/>
               <w:left w:val="nil"/>
@@ -299,7 +299,7 @@
     </w:p>
     <w:tbl>
       <w:tblPr>
-        <w:tblStyle w:val="11"/>
+        <w:tblStyle w:val="12"/>
         <w:tblW w:w="9705" w:type="dxa"/>
         <w:tblInd w:w="0" w:type="dxa"/>
         <w:tblBorders>
@@ -319,8 +319,8 @@
         </w:tblCellMar>
       </w:tblPr>
       <w:tblGrid>
-        <w:gridCol w:w="4513"/>
-        <w:gridCol w:w="5192"/>
+        <w:gridCol w:w="5018"/>
+        <w:gridCol w:w="4687"/>
       </w:tblGrid>
       <w:tr>
         <w:tblPrEx>
@@ -341,7 +341,7 @@
         </w:tblPrEx>
         <w:tc>
           <w:tcPr>
-            <w:tcW w:w="4513" w:type="dxa"/>
+            <w:tcW w:w="5018" w:type="dxa"/>
             <w:tcBorders>
               <w:top w:val="nil"/>
               <w:left w:val="nil"/>
@@ -373,7 +373,7 @@
         </w:tc>
         <w:tc>
           <w:tcPr>
-            <w:tcW w:w="5192" w:type="dxa"/>
+            <w:tcW w:w="4687" w:type="dxa"/>
             <w:tcBorders>
               <w:top w:val="nil"/>
               <w:left w:val="nil"/>
@@ -423,7 +423,7 @@
         </w:tblPrEx>
         <w:tc>
           <w:tcPr>
-            <w:tcW w:w="4513" w:type="dxa"/>
+            <w:tcW w:w="5018" w:type="dxa"/>
             <w:tcBorders>
               <w:top w:val="nil"/>
               <w:left w:val="nil"/>
@@ -455,7 +455,7 @@
         </w:tc>
         <w:tc>
           <w:tcPr>
-            <w:tcW w:w="5192" w:type="dxa"/>
+            <w:tcW w:w="4687" w:type="dxa"/>
             <w:tcBorders>
               <w:top w:val="nil"/>
               <w:left w:val="nil"/>
@@ -505,7 +505,7 @@
         </w:tblPrEx>
         <w:tc>
           <w:tcPr>
-            <w:tcW w:w="4513" w:type="dxa"/>
+            <w:tcW w:w="5018" w:type="dxa"/>
             <w:tcBorders>
               <w:top w:val="nil"/>
               <w:left w:val="nil"/>
@@ -537,7 +537,7 @@
         </w:tc>
         <w:tc>
           <w:tcPr>
-            <w:tcW w:w="5192" w:type="dxa"/>
+            <w:tcW w:w="4687" w:type="dxa"/>
             <w:tcBorders>
               <w:top w:val="nil"/>
               <w:left w:val="nil"/>
@@ -587,7 +587,7 @@
         </w:tblPrEx>
         <w:tc>
           <w:tcPr>
-            <w:tcW w:w="4513" w:type="dxa"/>
+            <w:tcW w:w="5018" w:type="dxa"/>
             <w:tcBorders>
               <w:top w:val="nil"/>
               <w:left w:val="nil"/>
@@ -619,7 +619,7 @@
         </w:tc>
         <w:tc>
           <w:tcPr>
-            <w:tcW w:w="5192" w:type="dxa"/>
+            <w:tcW w:w="4687" w:type="dxa"/>
             <w:tcBorders>
               <w:top w:val="nil"/>
               <w:left w:val="nil"/>
@@ -669,7 +669,7 @@
         </w:tblPrEx>
         <w:tc>
           <w:tcPr>
-            <w:tcW w:w="4513" w:type="dxa"/>
+            <w:tcW w:w="5018" w:type="dxa"/>
             <w:tcBorders>
               <w:top w:val="nil"/>
               <w:left w:val="nil"/>
@@ -701,7 +701,7 @@
         </w:tc>
         <w:tc>
           <w:tcPr>
-            <w:tcW w:w="5192" w:type="dxa"/>
+            <w:tcW w:w="4687" w:type="dxa"/>
             <w:tcBorders>
               <w:top w:val="nil"/>
               <w:left w:val="nil"/>
@@ -751,7 +751,7 @@
         </w:tblPrEx>
         <w:tc>
           <w:tcPr>
-            <w:tcW w:w="4513" w:type="dxa"/>
+            <w:tcW w:w="5018" w:type="dxa"/>
             <w:tcBorders>
               <w:top w:val="nil"/>
               <w:left w:val="nil"/>
@@ -783,7 +783,7 @@
         </w:tc>
         <w:tc>
           <w:tcPr>
-            <w:tcW w:w="5192" w:type="dxa"/>
+            <w:tcW w:w="4687" w:type="dxa"/>
             <w:tcBorders>
               <w:top w:val="nil"/>
               <w:left w:val="nil"/>
@@ -822,7 +822,7 @@
     </w:p>
     <w:tbl>
       <w:tblPr>
-        <w:tblStyle w:val="11"/>
+        <w:tblStyle w:val="12"/>
         <w:tblW w:w="9705" w:type="dxa"/>
         <w:tblInd w:w="0" w:type="dxa"/>
         <w:tblBorders>
@@ -842,8 +842,8 @@
         </w:tblCellMar>
       </w:tblPr>
       <w:tblGrid>
-        <w:gridCol w:w="4513"/>
-        <w:gridCol w:w="5192"/>
+        <w:gridCol w:w="5018"/>
+        <w:gridCol w:w="4687"/>
       </w:tblGrid>
       <w:tr>
         <w:tblPrEx>
@@ -864,7 +864,7 @@
         </w:tblPrEx>
         <w:tc>
           <w:tcPr>
-            <w:tcW w:w="4513" w:type="dxa"/>
+            <w:tcW w:w="5018" w:type="dxa"/>
             <w:tcBorders>
               <w:top w:val="nil"/>
               <w:left w:val="nil"/>
@@ -896,7 +896,7 @@
         </w:tc>
         <w:tc>
           <w:tcPr>
-            <w:tcW w:w="5192" w:type="dxa"/>
+            <w:tcW w:w="4687" w:type="dxa"/>
             <w:tcBorders>
               <w:top w:val="nil"/>
               <w:left w:val="nil"/>
@@ -946,7 +946,7 @@
         </w:tblPrEx>
         <w:tc>
           <w:tcPr>
-            <w:tcW w:w="4513" w:type="dxa"/>
+            <w:tcW w:w="5018" w:type="dxa"/>
             <w:tcBorders>
               <w:top w:val="nil"/>
               <w:left w:val="nil"/>
@@ -978,7 +978,7 @@
         </w:tc>
         <w:tc>
           <w:tcPr>
-            <w:tcW w:w="5192" w:type="dxa"/>
+            <w:tcW w:w="4687" w:type="dxa"/>
             <w:tcBorders>
               <w:top w:val="nil"/>
               <w:left w:val="nil"/>
@@ -1028,7 +1028,7 @@
         </w:tblPrEx>
         <w:tc>
           <w:tcPr>
-            <w:tcW w:w="4513" w:type="dxa"/>
+            <w:tcW w:w="5018" w:type="dxa"/>
             <w:tcBorders>
               <w:top w:val="nil"/>
               <w:left w:val="nil"/>
@@ -1060,7 +1060,7 @@
         </w:tc>
         <w:tc>
           <w:tcPr>
-            <w:tcW w:w="5192" w:type="dxa"/>
+            <w:tcW w:w="4687" w:type="dxa"/>
             <w:tcBorders>
               <w:top w:val="nil"/>
               <w:left w:val="nil"/>
@@ -1110,7 +1110,7 @@
         </w:tblPrEx>
         <w:tc>
           <w:tcPr>
-            <w:tcW w:w="4513" w:type="dxa"/>
+            <w:tcW w:w="5018" w:type="dxa"/>
             <w:tcBorders>
               <w:top w:val="nil"/>
               <w:left w:val="nil"/>
@@ -1142,7 +1142,7 @@
         </w:tc>
         <w:tc>
           <w:tcPr>
-            <w:tcW w:w="5192" w:type="dxa"/>
+            <w:tcW w:w="4687" w:type="dxa"/>
             <w:tcBorders>
               <w:top w:val="nil"/>
               <w:left w:val="nil"/>
@@ -1192,7 +1192,7 @@
         </w:tblPrEx>
         <w:tc>
           <w:tcPr>
-            <w:tcW w:w="4513" w:type="dxa"/>
+            <w:tcW w:w="5018" w:type="dxa"/>
             <w:tcBorders>
               <w:top w:val="nil"/>
               <w:left w:val="nil"/>
@@ -1224,7 +1224,7 @@
         </w:tc>
         <w:tc>
           <w:tcPr>
-            <w:tcW w:w="5192" w:type="dxa"/>
+            <w:tcW w:w="4687" w:type="dxa"/>
             <w:tcBorders>
               <w:top w:val="nil"/>
               <w:left w:val="nil"/>
@@ -1274,7 +1274,7 @@
         </w:tblPrEx>
         <w:tc>
           <w:tcPr>
-            <w:tcW w:w="4513" w:type="dxa"/>
+            <w:tcW w:w="5018" w:type="dxa"/>
             <w:tcBorders>
               <w:top w:val="nil"/>
               <w:left w:val="nil"/>
@@ -1306,7 +1306,7 @@
         </w:tc>
         <w:tc>
           <w:tcPr>
-            <w:tcW w:w="5192" w:type="dxa"/>
+            <w:tcW w:w="4687" w:type="dxa"/>
             <w:tcBorders>
               <w:top w:val="nil"/>
               <w:left w:val="nil"/>
@@ -1377,7 +1377,7 @@
     </w:p>
     <w:tbl>
       <w:tblPr>
-        <w:tblStyle w:val="11"/>
+        <w:tblStyle w:val="12"/>
         <w:tblW w:w="9705" w:type="dxa"/>
         <w:tblInd w:w="0" w:type="dxa"/>
         <w:tblBorders>
@@ -1397,8 +1397,8 @@
         </w:tblCellMar>
       </w:tblPr>
       <w:tblGrid>
-        <w:gridCol w:w="4513"/>
-        <w:gridCol w:w="5192"/>
+        <w:gridCol w:w="5018"/>
+        <w:gridCol w:w="4687"/>
       </w:tblGrid>
       <w:tr>
         <w:tblPrEx>
@@ -1419,7 +1419,7 @@
         </w:tblPrEx>
         <w:tc>
           <w:tcPr>
-            <w:tcW w:w="4513" w:type="dxa"/>
+            <w:tcW w:w="5018" w:type="dxa"/>
             <w:tcBorders>
               <w:top w:val="nil"/>
               <w:left w:val="nil"/>
@@ -1451,7 +1451,7 @@
         </w:tc>
         <w:tc>
           <w:tcPr>
-            <w:tcW w:w="5192" w:type="dxa"/>
+            <w:tcW w:w="4687" w:type="dxa"/>
             <w:tcBorders>
               <w:top w:val="nil"/>
               <w:left w:val="nil"/>
@@ -1501,7 +1501,7 @@
         </w:tblPrEx>
         <w:tc>
           <w:tcPr>
-            <w:tcW w:w="4513" w:type="dxa"/>
+            <w:tcW w:w="5018" w:type="dxa"/>
             <w:tcBorders>
               <w:top w:val="nil"/>
               <w:left w:val="nil"/>
@@ -1533,7 +1533,7 @@
         </w:tc>
         <w:tc>
           <w:tcPr>
-            <w:tcW w:w="5192" w:type="dxa"/>
+            <w:tcW w:w="4687" w:type="dxa"/>
             <w:tcBorders>
               <w:top w:val="nil"/>
               <w:left w:val="nil"/>
@@ -1583,7 +1583,7 @@
         </w:tblPrEx>
         <w:tc>
           <w:tcPr>
-            <w:tcW w:w="4513" w:type="dxa"/>
+            <w:tcW w:w="5018" w:type="dxa"/>
             <w:tcBorders>
               <w:top w:val="nil"/>
               <w:left w:val="nil"/>
@@ -1615,7 +1615,7 @@
         </w:tc>
         <w:tc>
           <w:tcPr>
-            <w:tcW w:w="5192" w:type="dxa"/>
+            <w:tcW w:w="4687" w:type="dxa"/>
             <w:tcBorders>
               <w:top w:val="nil"/>
               <w:left w:val="nil"/>
@@ -1665,7 +1665,7 @@
         </w:tblPrEx>
         <w:tc>
           <w:tcPr>
-            <w:tcW w:w="4513" w:type="dxa"/>
+            <w:tcW w:w="5018" w:type="dxa"/>
             <w:tcBorders>
               <w:top w:val="nil"/>
               <w:left w:val="nil"/>
@@ -1697,7 +1697,7 @@
         </w:tc>
         <w:tc>
           <w:tcPr>
-            <w:tcW w:w="5192" w:type="dxa"/>
+            <w:tcW w:w="4687" w:type="dxa"/>
             <w:tcBorders>
               <w:top w:val="nil"/>
               <w:left w:val="nil"/>
@@ -1747,7 +1747,7 @@
         </w:tblPrEx>
         <w:tc>
           <w:tcPr>
-            <w:tcW w:w="4513" w:type="dxa"/>
+            <w:tcW w:w="5018" w:type="dxa"/>
             <w:tcBorders>
               <w:top w:val="nil"/>
               <w:left w:val="nil"/>
@@ -1779,7 +1779,7 @@
         </w:tc>
         <w:tc>
           <w:tcPr>
-            <w:tcW w:w="5192" w:type="dxa"/>
+            <w:tcW w:w="4687" w:type="dxa"/>
             <w:tcBorders>
               <w:top w:val="nil"/>
               <w:left w:val="nil"/>
@@ -1829,7 +1829,7 @@
         </w:tblPrEx>
         <w:tc>
           <w:tcPr>
-            <w:tcW w:w="4513" w:type="dxa"/>
+            <w:tcW w:w="5018" w:type="dxa"/>
             <w:tcBorders>
               <w:top w:val="nil"/>
               <w:left w:val="nil"/>
@@ -1861,7 +1861,7 @@
         </w:tc>
         <w:tc>
           <w:tcPr>
-            <w:tcW w:w="5192" w:type="dxa"/>
+            <w:tcW w:w="4687" w:type="dxa"/>
             <w:tcBorders>
               <w:top w:val="nil"/>
               <w:left w:val="nil"/>
@@ -1911,7 +1911,7 @@
         </w:tblPrEx>
         <w:tc>
           <w:tcPr>
-            <w:tcW w:w="4513" w:type="dxa"/>
+            <w:tcW w:w="5018" w:type="dxa"/>
             <w:tcBorders>
               <w:top w:val="nil"/>
               <w:left w:val="nil"/>
@@ -1943,7 +1943,7 @@
         </w:tc>
         <w:tc>
           <w:tcPr>
-            <w:tcW w:w="5192" w:type="dxa"/>
+            <w:tcW w:w="4687" w:type="dxa"/>
             <w:tcBorders>
               <w:top w:val="nil"/>
               <w:left w:val="nil"/>
@@ -1993,7 +1993,7 @@
         </w:tblPrEx>
         <w:tc>
           <w:tcPr>
-            <w:tcW w:w="4513" w:type="dxa"/>
+            <w:tcW w:w="5018" w:type="dxa"/>
             <w:tcBorders>
               <w:top w:val="nil"/>
               <w:left w:val="nil"/>
@@ -2025,7 +2025,7 @@
         </w:tc>
         <w:tc>
           <w:tcPr>
-            <w:tcW w:w="5192" w:type="dxa"/>
+            <w:tcW w:w="4687" w:type="dxa"/>
             <w:tcBorders>
               <w:top w:val="nil"/>
               <w:left w:val="nil"/>
@@ -2075,7 +2075,7 @@
         </w:tblPrEx>
         <w:tc>
           <w:tcPr>
-            <w:tcW w:w="4513" w:type="dxa"/>
+            <w:tcW w:w="5018" w:type="dxa"/>
             <w:tcBorders>
               <w:top w:val="nil"/>
               <w:left w:val="nil"/>
@@ -2107,7 +2107,7 @@
         </w:tc>
         <w:tc>
           <w:tcPr>
-            <w:tcW w:w="5192" w:type="dxa"/>
+            <w:tcW w:w="4687" w:type="dxa"/>
             <w:tcBorders>
               <w:top w:val="nil"/>
               <w:left w:val="nil"/>
@@ -2157,7 +2157,7 @@
         </w:tblPrEx>
         <w:tc>
           <w:tcPr>
-            <w:tcW w:w="4513" w:type="dxa"/>
+            <w:tcW w:w="5018" w:type="dxa"/>
             <w:tcBorders>
               <w:top w:val="nil"/>
               <w:left w:val="nil"/>
@@ -2189,7 +2189,7 @@
         </w:tc>
         <w:tc>
           <w:tcPr>
-            <w:tcW w:w="5192" w:type="dxa"/>
+            <w:tcW w:w="4687" w:type="dxa"/>
             <w:tcBorders>
               <w:top w:val="nil"/>
               <w:left w:val="nil"/>
@@ -2239,7 +2239,7 @@
         </w:tblPrEx>
         <w:tc>
           <w:tcPr>
-            <w:tcW w:w="4513" w:type="dxa"/>
+            <w:tcW w:w="5018" w:type="dxa"/>
             <w:tcBorders>
               <w:top w:val="nil"/>
               <w:left w:val="nil"/>
@@ -2271,7 +2271,7 @@
         </w:tc>
         <w:tc>
           <w:tcPr>
-            <w:tcW w:w="5192" w:type="dxa"/>
+            <w:tcW w:w="4687" w:type="dxa"/>
             <w:tcBorders>
               <w:top w:val="nil"/>
               <w:left w:val="nil"/>
@@ -2321,7 +2321,7 @@
         </w:tblPrEx>
         <w:tc>
           <w:tcPr>
-            <w:tcW w:w="4513" w:type="dxa"/>
+            <w:tcW w:w="5018" w:type="dxa"/>
             <w:tcBorders>
               <w:top w:val="nil"/>
               <w:left w:val="nil"/>
@@ -2347,13 +2347,34 @@
                 <w:sz w:val="21"/>
                 <w:szCs w:val="21"/>
               </w:rPr>
-              <w:t>(6) Eine Lizenzierung von Markenrechten (z. B. „Der Grüne Punkt") ist nicht Gegenstand dieses Vertrages.</w:t>
-            </w:r>
-          </w:p>
-        </w:tc>
-        <w:tc>
-          <w:tcPr>
-            <w:tcW w:w="5192" w:type="dxa"/>
+              <w:t>(</w:t>
+            </w:r>
+            <w:r>
+              <w:rPr>
+                <w:rFonts w:hint="eastAsia" w:eastAsia="宋体" w:cs="Times New Roman"/>
+                <w:b w:val="0"/>
+                <w:bCs w:val="0"/>
+                <w:sz w:val="21"/>
+                <w:szCs w:val="21"/>
+                <w:lang w:val="en-US" w:eastAsia="zh-CN"/>
+              </w:rPr>
+              <w:t>6</w:t>
+            </w:r>
+            <w:r>
+              <w:rPr>
+                <w:rFonts w:ascii="Times New Roman" w:hAnsi="Times New Roman" w:eastAsia="Times New Roman" w:cs="Times New Roman"/>
+                <w:b w:val="0"/>
+                <w:bCs w:val="0"/>
+                <w:sz w:val="21"/>
+                <w:szCs w:val="21"/>
+              </w:rPr>
+              <w:t>) Die Bestellung gilt ab Vertragsbeginn für sämtliche vom Kunden im Geltungsbereich des VerpackG in Verkehr gebrachten Verpackungen. Bei Inkrafttreten des VerpackDG/PPWR zum 12. August 2026 setzt sich die Bevollmächtigung unter dem neuen Rechtsrahmen fort.</w:t>
+            </w:r>
+          </w:p>
+        </w:tc>
+        <w:tc>
+          <w:tcPr>
+            <w:tcW w:w="4687" w:type="dxa"/>
             <w:tcBorders>
               <w:top w:val="nil"/>
               <w:left w:val="nil"/>
@@ -2379,80 +2400,19 @@
                 <w:sz w:val="21"/>
                 <w:szCs w:val="21"/>
               </w:rPr>
-              <w:t>(6) 商标使用许可（如"绿点"标识）不属于本合同标的。</w:t>
-            </w:r>
-          </w:p>
-        </w:tc>
-      </w:tr>
-      <w:tr>
-        <w:tblPrEx>
-          <w:tblBorders>
-            <w:top w:val="single" w:color="auto" w:sz="4" w:space="0"/>
-            <w:left w:val="single" w:color="auto" w:sz="4" w:space="0"/>
-            <w:bottom w:val="single" w:color="auto" w:sz="4" w:space="0"/>
-            <w:right w:val="single" w:color="auto" w:sz="4" w:space="0"/>
-            <w:insideH w:val="single" w:color="auto" w:sz="4" w:space="0"/>
-            <w:insideV w:val="single" w:color="auto" w:sz="4" w:space="0"/>
-          </w:tblBorders>
-          <w:tblCellMar>
-            <w:top w:w="0" w:type="dxa"/>
-            <w:left w:w="10" w:type="dxa"/>
-            <w:bottom w:w="0" w:type="dxa"/>
-            <w:right w:w="10" w:type="dxa"/>
-          </w:tblCellMar>
-        </w:tblPrEx>
-        <w:tc>
-          <w:tcPr>
-            <w:tcW w:w="4513" w:type="dxa"/>
-            <w:tcBorders>
-              <w:top w:val="nil"/>
-              <w:left w:val="nil"/>
-              <w:bottom w:val="nil"/>
-              <w:right w:val="nil"/>
-            </w:tcBorders>
-            <w:tcMar>
-              <w:top w:w="10" w:type="dxa"/>
-              <w:left w:w="0" w:type="dxa"/>
-              <w:bottom w:w="10" w:type="dxa"/>
-              <w:right w:w="80" w:type="dxa"/>
-            </w:tcMar>
-          </w:tcPr>
-          <w:p>
-            <w:pPr>
-              <w:spacing w:before="20" w:after="20"/>
-            </w:pPr>
-            <w:r>
-              <w:rPr>
-                <w:rFonts w:ascii="Times New Roman" w:hAnsi="Times New Roman" w:eastAsia="Times New Roman" w:cs="Times New Roman"/>
-                <w:b w:val="0"/>
-                <w:bCs w:val="0"/>
-                <w:sz w:val="21"/>
-                <w:szCs w:val="21"/>
-              </w:rPr>
-              <w:t>(7) Die Bestellung gilt ab Vertragsbeginn für sämtliche vom Kunden im Geltungsbereich des VerpackG in Verkehr gebrachten Verpackungen. Bei Inkrafttreten des VerpackDG/PPWR zum 12. August 2026 setzt sich die Bevollmächtigung unter dem neuen Rechtsrahmen fort.</w:t>
-            </w:r>
-          </w:p>
-        </w:tc>
-        <w:tc>
-          <w:tcPr>
-            <w:tcW w:w="5192" w:type="dxa"/>
-            <w:tcBorders>
-              <w:top w:val="nil"/>
-              <w:left w:val="nil"/>
-              <w:bottom w:val="nil"/>
-              <w:right w:val="nil"/>
-            </w:tcBorders>
-            <w:tcMar>
-              <w:top w:w="10" w:type="dxa"/>
-              <w:left w:w="80" w:type="dxa"/>
-              <w:bottom w:w="10" w:type="dxa"/>
-              <w:right w:w="0" w:type="dxa"/>
-            </w:tcMar>
-          </w:tcPr>
-          <w:p>
-            <w:pPr>
-              <w:spacing w:before="20" w:after="20"/>
-            </w:pPr>
+              <w:t>(</w:t>
+            </w:r>
+            <w:r>
+              <w:rPr>
+                <w:rFonts w:hint="eastAsia" w:ascii="宋体" w:hAnsi="宋体" w:eastAsia="宋体" w:cs="宋体"/>
+                <w:b w:val="0"/>
+                <w:bCs w:val="0"/>
+                <w:sz w:val="21"/>
+                <w:szCs w:val="21"/>
+                <w:lang w:val="en-US" w:eastAsia="zh-CN"/>
+              </w:rPr>
+              <w:t>6</w:t>
+            </w:r>
             <w:r>
               <w:rPr>
                 <w:rFonts w:ascii="宋体" w:hAnsi="宋体" w:eastAsia="宋体" w:cs="宋体"/>
@@ -2461,7 +2421,7 @@
                 <w:sz w:val="21"/>
                 <w:szCs w:val="21"/>
               </w:rPr>
-              <w:t>(7) 本授权自合同生效起适用于客户在《包装法》适用范围内投放的所有包装。2026年8月12日《包装法实施法》/PPWR生效后，授权在新的法律框架下继续有效。</w:t>
+              <w:t>) 本授权自合同生效起适用于客户在《包装法》适用范围内投放的所有包装。2026年8月12日《包装法实施法》/PPWR生效后，授权在新的法律框架下继续有效。</w:t>
             </w:r>
           </w:p>
         </w:tc>
@@ -2506,7 +2466,7 @@
     </w:p>
     <w:tbl>
       <w:tblPr>
-        <w:tblStyle w:val="11"/>
+        <w:tblStyle w:val="12"/>
         <w:tblW w:w="9705" w:type="dxa"/>
         <w:tblInd w:w="0" w:type="dxa"/>
         <w:tblBorders>
@@ -2526,8 +2486,8 @@
         </w:tblCellMar>
       </w:tblPr>
       <w:tblGrid>
-        <w:gridCol w:w="4513"/>
-        <w:gridCol w:w="5192"/>
+        <w:gridCol w:w="5018"/>
+        <w:gridCol w:w="4687"/>
       </w:tblGrid>
       <w:tr>
         <w:tblPrEx>
@@ -2548,7 +2508,7 @@
         </w:tblPrEx>
         <w:tc>
           <w:tcPr>
-            <w:tcW w:w="4513" w:type="dxa"/>
+            <w:tcW w:w="5018" w:type="dxa"/>
             <w:tcBorders>
               <w:top w:val="nil"/>
               <w:left w:val="nil"/>
@@ -2580,7 +2540,7 @@
         </w:tc>
         <w:tc>
           <w:tcPr>
-            <w:tcW w:w="5192" w:type="dxa"/>
+            <w:tcW w:w="4687" w:type="dxa"/>
             <w:tcBorders>
               <w:top w:val="nil"/>
               <w:left w:val="nil"/>
@@ -2630,7 +2590,7 @@
         </w:tblPrEx>
         <w:tc>
           <w:tcPr>
-            <w:tcW w:w="4513" w:type="dxa"/>
+            <w:tcW w:w="5018" w:type="dxa"/>
             <w:tcBorders>
               <w:top w:val="nil"/>
               <w:left w:val="nil"/>
@@ -2662,7 +2622,7 @@
         </w:tc>
         <w:tc>
           <w:tcPr>
-            <w:tcW w:w="5192" w:type="dxa"/>
+            <w:tcW w:w="4687" w:type="dxa"/>
             <w:tcBorders>
               <w:top w:val="nil"/>
               <w:left w:val="nil"/>
@@ -2712,7 +2672,7 @@
         </w:tblPrEx>
         <w:tc>
           <w:tcPr>
-            <w:tcW w:w="4513" w:type="dxa"/>
+            <w:tcW w:w="5018" w:type="dxa"/>
             <w:tcBorders>
               <w:top w:val="nil"/>
               <w:left w:val="nil"/>
@@ -2738,13 +2698,55 @@
                 <w:sz w:val="21"/>
                 <w:szCs w:val="21"/>
               </w:rPr>
-              <w:t>(3) Der Kunde übermittelt dem Bevollmächtigten jährlich bis zum 15. Februar des Folgejahres vollständige und wahrheitsgemäße Angaben zu allen im vorangegangenen Kalenderjahr in Verkehr gebrachten Verpackungen, aufgeschlüsselt nach Materialfraktionen und Verpackungskategorien.</w:t>
-            </w:r>
-          </w:p>
-        </w:tc>
-        <w:tc>
-          <w:tcPr>
-            <w:tcW w:w="5192" w:type="dxa"/>
+              <w:t xml:space="preserve">(3) Der Kunde übermittelt dem Bevollmächtigten jährlich bis zum </w:t>
+            </w:r>
+            <w:r>
+              <w:rPr>
+                <w:rFonts w:hint="eastAsia" w:eastAsia="宋体" w:cs="Times New Roman"/>
+                <w:b w:val="0"/>
+                <w:bCs w:val="0"/>
+                <w:sz w:val="21"/>
+                <w:szCs w:val="21"/>
+                <w:lang w:val="en-US" w:eastAsia="zh-CN"/>
+              </w:rPr>
+              <w:t>1</w:t>
+            </w:r>
+            <w:r>
+              <w:rPr>
+                <w:rFonts w:ascii="Times New Roman" w:hAnsi="Times New Roman" w:eastAsia="Times New Roman" w:cs="Times New Roman"/>
+                <w:b w:val="0"/>
+                <w:bCs w:val="0"/>
+                <w:sz w:val="21"/>
+                <w:szCs w:val="21"/>
+              </w:rPr>
+              <w:t xml:space="preserve">. </w:t>
+            </w:r>
+            <w:r>
+              <w:rPr>
+                <w:rFonts w:hint="default" w:cs="Times New Roman"/>
+                <w:b w:val="0"/>
+                <w:bCs w:val="0"/>
+                <w:sz w:val="21"/>
+                <w:szCs w:val="21"/>
+                <w:lang w:val="de-DE"/>
+              </w:rPr>
+              <w:t>März</w:t>
+            </w:r>
+            <w:r>
+              <w:rPr>
+                <w:rFonts w:ascii="Times New Roman" w:hAnsi="Times New Roman" w:eastAsia="Times New Roman" w:cs="Times New Roman"/>
+                <w:b w:val="0"/>
+                <w:bCs w:val="0"/>
+                <w:sz w:val="21"/>
+                <w:szCs w:val="21"/>
+              </w:rPr>
+              <w:t xml:space="preserve"> des Folgejahres vollständige und wahrheitsgemäße Angaben zu allen im vorangegangenen Kalenderjahr in Verkehr gebrachten Verpackungen, aufgeschlüsselt nach Materialfraktionen und Verpackungskategorien.</w:t>
+            </w:r>
+          </w:p>
+        </w:tc>
+        <w:tc>
+          <w:tcPr>
+            <w:tcW w:w="4687" w:type="dxa"/>
             <w:tcBorders>
               <w:top w:val="nil"/>
               <w:left w:val="nil"/>
@@ -2770,7 +2772,49 @@
                 <w:sz w:val="21"/>
                 <w:szCs w:val="21"/>
               </w:rPr>
-              <w:t>(3) 客户每年应在次年2月15日前向授权代表提供上一日历年投放市场的所有包装的完整真实数据，按材料类别和包装类别细分。</w:t>
+              <w:t>(3) 客户每年应在次年</w:t>
+            </w:r>
+            <w:r>
+              <w:rPr>
+                <w:rFonts w:hint="eastAsia" w:ascii="宋体" w:hAnsi="宋体" w:eastAsia="宋体" w:cs="宋体"/>
+                <w:b w:val="0"/>
+                <w:bCs w:val="0"/>
+                <w:sz w:val="21"/>
+                <w:szCs w:val="21"/>
+                <w:lang w:val="en-US" w:eastAsia="zh-CN"/>
+              </w:rPr>
+              <w:t>3</w:t>
+            </w:r>
+            <w:r>
+              <w:rPr>
+                <w:rFonts w:ascii="宋体" w:hAnsi="宋体" w:eastAsia="宋体" w:cs="宋体"/>
+                <w:b w:val="0"/>
+                <w:bCs w:val="0"/>
+                <w:sz w:val="21"/>
+                <w:szCs w:val="21"/>
+              </w:rPr>
+              <w:t>月</w:t>
+            </w:r>
+            <w:r>
+              <w:rPr>
+                <w:rFonts w:hint="eastAsia" w:ascii="宋体" w:hAnsi="宋体" w:eastAsia="宋体" w:cs="宋体"/>
+                <w:b w:val="0"/>
+                <w:bCs w:val="0"/>
+                <w:sz w:val="21"/>
+                <w:szCs w:val="21"/>
+                <w:lang w:val="en-US" w:eastAsia="zh-CN"/>
+              </w:rPr>
+              <w:t>1</w:t>
+            </w:r>
+            <w:r>
+              <w:rPr>
+                <w:rFonts w:ascii="宋体" w:hAnsi="宋体" w:eastAsia="宋体" w:cs="宋体"/>
+                <w:b w:val="0"/>
+                <w:bCs w:val="0"/>
+                <w:sz w:val="21"/>
+                <w:szCs w:val="21"/>
+              </w:rPr>
+              <w:t>日前向授权代表提供上一日历年投放市场的所有包装的完整真实数据，按材料类别和包装类别细分。</w:t>
             </w:r>
           </w:p>
         </w:tc>
@@ -2794,7 +2838,7 @@
         </w:tblPrEx>
         <w:tc>
           <w:tcPr>
-            <w:tcW w:w="4513" w:type="dxa"/>
+            <w:tcW w:w="5018" w:type="dxa"/>
             <w:tcBorders>
               <w:top w:val="nil"/>
               <w:left w:val="nil"/>
@@ -2826,7 +2870,7 @@
         </w:tc>
         <w:tc>
           <w:tcPr>
-            <w:tcW w:w="5192" w:type="dxa"/>
+            <w:tcW w:w="4687" w:type="dxa"/>
             <w:tcBorders>
               <w:top w:val="nil"/>
               <w:left w:val="nil"/>
@@ -2876,7 +2920,7 @@
         </w:tblPrEx>
         <w:tc>
           <w:tcPr>
-            <w:tcW w:w="4513" w:type="dxa"/>
+            <w:tcW w:w="5018" w:type="dxa"/>
             <w:tcBorders>
               <w:top w:val="nil"/>
               <w:left w:val="nil"/>
@@ -2908,7 +2952,7 @@
         </w:tc>
         <w:tc>
           <w:tcPr>
-            <w:tcW w:w="5192" w:type="dxa"/>
+            <w:tcW w:w="4687" w:type="dxa"/>
             <w:tcBorders>
               <w:top w:val="nil"/>
               <w:left w:val="nil"/>
@@ -2958,7 +3002,7 @@
         </w:tblPrEx>
         <w:tc>
           <w:tcPr>
-            <w:tcW w:w="4513" w:type="dxa"/>
+            <w:tcW w:w="5018" w:type="dxa"/>
             <w:tcBorders>
               <w:top w:val="nil"/>
               <w:left w:val="nil"/>
@@ -2990,7 +3034,7 @@
         </w:tc>
         <w:tc>
           <w:tcPr>
-            <w:tcW w:w="5192" w:type="dxa"/>
+            <w:tcW w:w="4687" w:type="dxa"/>
             <w:tcBorders>
               <w:top w:val="nil"/>
               <w:left w:val="nil"/>
@@ -3061,7 +3105,7 @@
     </w:p>
     <w:tbl>
       <w:tblPr>
-        <w:tblStyle w:val="11"/>
+        <w:tblStyle w:val="12"/>
         <w:tblW w:w="9705" w:type="dxa"/>
         <w:tblInd w:w="0" w:type="dxa"/>
         <w:tblBorders>
@@ -3081,8 +3125,8 @@
         </w:tblCellMar>
       </w:tblPr>
       <w:tblGrid>
-        <w:gridCol w:w="4513"/>
-        <w:gridCol w:w="5192"/>
+        <w:gridCol w:w="5018"/>
+        <w:gridCol w:w="4687"/>
       </w:tblGrid>
       <w:tr>
         <w:tblPrEx>
@@ -3103,7 +3147,7 @@
         </w:tblPrEx>
         <w:tc>
           <w:tcPr>
-            <w:tcW w:w="4513" w:type="dxa"/>
+            <w:tcW w:w="5018" w:type="dxa"/>
             <w:tcBorders>
               <w:top w:val="nil"/>
               <w:left w:val="nil"/>
@@ -3135,7 +3179,7 @@
         </w:tc>
         <w:tc>
           <w:tcPr>
-            <w:tcW w:w="5192" w:type="dxa"/>
+            <w:tcW w:w="4687" w:type="dxa"/>
             <w:tcBorders>
               <w:top w:val="nil"/>
               <w:left w:val="nil"/>
@@ -3185,7 +3229,7 @@
         </w:tblPrEx>
         <w:tc>
           <w:tcPr>
-            <w:tcW w:w="4513" w:type="dxa"/>
+            <w:tcW w:w="5018" w:type="dxa"/>
             <w:tcBorders>
               <w:top w:val="nil"/>
               <w:left w:val="nil"/>
@@ -3217,7 +3261,7 @@
         </w:tc>
         <w:tc>
           <w:tcPr>
-            <w:tcW w:w="5192" w:type="dxa"/>
+            <w:tcW w:w="4687" w:type="dxa"/>
             <w:tcBorders>
               <w:top w:val="nil"/>
               <w:left w:val="nil"/>
@@ -3267,7 +3311,7 @@
         </w:tblPrEx>
         <w:tc>
           <w:tcPr>
-            <w:tcW w:w="4513" w:type="dxa"/>
+            <w:tcW w:w="5018" w:type="dxa"/>
             <w:tcBorders>
               <w:top w:val="nil"/>
               <w:left w:val="nil"/>
@@ -3299,7 +3343,7 @@
         </w:tc>
         <w:tc>
           <w:tcPr>
-            <w:tcW w:w="5192" w:type="dxa"/>
+            <w:tcW w:w="4687" w:type="dxa"/>
             <w:tcBorders>
               <w:top w:val="nil"/>
               <w:left w:val="nil"/>
@@ -3349,7 +3393,7 @@
         </w:tblPrEx>
         <w:tc>
           <w:tcPr>
-            <w:tcW w:w="4513" w:type="dxa"/>
+            <w:tcW w:w="5018" w:type="dxa"/>
             <w:tcBorders>
               <w:top w:val="nil"/>
               <w:left w:val="nil"/>
@@ -3381,7 +3425,7 @@
         </w:tc>
         <w:tc>
           <w:tcPr>
-            <w:tcW w:w="5192" w:type="dxa"/>
+            <w:tcW w:w="4687" w:type="dxa"/>
             <w:tcBorders>
               <w:top w:val="nil"/>
               <w:left w:val="nil"/>
@@ -3431,7 +3475,7 @@
         </w:tblPrEx>
         <w:tc>
           <w:tcPr>
-            <w:tcW w:w="4513" w:type="dxa"/>
+            <w:tcW w:w="5018" w:type="dxa"/>
             <w:tcBorders>
               <w:top w:val="nil"/>
               <w:left w:val="nil"/>
@@ -3463,7 +3507,7 @@
         </w:tc>
         <w:tc>
           <w:tcPr>
-            <w:tcW w:w="5192" w:type="dxa"/>
+            <w:tcW w:w="4687" w:type="dxa"/>
             <w:tcBorders>
               <w:top w:val="nil"/>
               <w:left w:val="nil"/>
@@ -3513,7 +3557,7 @@
         </w:tblPrEx>
         <w:tc>
           <w:tcPr>
-            <w:tcW w:w="4513" w:type="dxa"/>
+            <w:tcW w:w="5018" w:type="dxa"/>
             <w:tcBorders>
               <w:top w:val="nil"/>
               <w:left w:val="nil"/>
@@ -3545,7 +3589,7 @@
         </w:tc>
         <w:tc>
           <w:tcPr>
-            <w:tcW w:w="5192" w:type="dxa"/>
+            <w:tcW w:w="4687" w:type="dxa"/>
             <w:tcBorders>
               <w:top w:val="nil"/>
               <w:left w:val="nil"/>
@@ -3616,7 +3660,7 @@
     </w:p>
     <w:tbl>
       <w:tblPr>
-        <w:tblStyle w:val="11"/>
+        <w:tblStyle w:val="12"/>
         <w:tblW w:w="9705" w:type="dxa"/>
         <w:tblInd w:w="0" w:type="dxa"/>
         <w:tblBorders>
@@ -3636,8 +3680,8 @@
         </w:tblCellMar>
       </w:tblPr>
       <w:tblGrid>
-        <w:gridCol w:w="4513"/>
-        <w:gridCol w:w="5192"/>
+        <w:gridCol w:w="5018"/>
+        <w:gridCol w:w="4687"/>
       </w:tblGrid>
       <w:tr>
         <w:tblPrEx>
@@ -3658,7 +3702,7 @@
         </w:tblPrEx>
         <w:tc>
           <w:tcPr>
-            <w:tcW w:w="4513" w:type="dxa"/>
+            <w:tcW w:w="5018" w:type="dxa"/>
             <w:tcBorders>
               <w:top w:val="nil"/>
               <w:left w:val="nil"/>
@@ -3690,7 +3734,7 @@
         </w:tc>
         <w:tc>
           <w:tcPr>
-            <w:tcW w:w="5192" w:type="dxa"/>
+            <w:tcW w:w="4687" w:type="dxa"/>
             <w:tcBorders>
               <w:top w:val="nil"/>
               <w:left w:val="nil"/>
@@ -3740,7 +3784,7 @@
         </w:tblPrEx>
         <w:tc>
           <w:tcPr>
-            <w:tcW w:w="4513" w:type="dxa"/>
+            <w:tcW w:w="5018" w:type="dxa"/>
             <w:tcBorders>
               <w:top w:val="nil"/>
               <w:left w:val="nil"/>
@@ -3766,13 +3810,34 @@
                 <w:sz w:val="21"/>
                 <w:szCs w:val="21"/>
               </w:rPr>
-              <w:t>(2) Die jährliche Ist-Mengen-Meldung erfolgt bis zum 15. Februar des Folgejahres über das Online-Portal des Bevollmächtigten.</w:t>
-            </w:r>
-          </w:p>
-        </w:tc>
-        <w:tc>
-          <w:tcPr>
-            <w:tcW w:w="5192" w:type="dxa"/>
+              <w:t xml:space="preserve">(2) Die jährliche Ist-Mengen-Meldung erfolgt bis zum 1. </w:t>
+            </w:r>
+            <w:r>
+              <w:rPr>
+                <w:rFonts w:hint="default" w:cs="Times New Roman"/>
+                <w:b w:val="0"/>
+                <w:bCs w:val="0"/>
+                <w:sz w:val="21"/>
+                <w:szCs w:val="21"/>
+                <w:lang w:val="de-DE"/>
+              </w:rPr>
+              <w:t>März</w:t>
+            </w:r>
+            <w:r>
+              <w:rPr>
+                <w:rFonts w:ascii="Times New Roman" w:hAnsi="Times New Roman" w:eastAsia="Times New Roman" w:cs="Times New Roman"/>
+                <w:b w:val="0"/>
+                <w:bCs w:val="0"/>
+                <w:sz w:val="21"/>
+                <w:szCs w:val="21"/>
+              </w:rPr>
+              <w:t xml:space="preserve"> des Folgejahres über das Online-Portal des Bevollmächtigten.</w:t>
+            </w:r>
+          </w:p>
+        </w:tc>
+        <w:tc>
+          <w:tcPr>
+            <w:tcW w:w="4687" w:type="dxa"/>
             <w:tcBorders>
               <w:top w:val="nil"/>
               <w:left w:val="nil"/>
@@ -3798,7 +3863,28 @@
                 <w:sz w:val="21"/>
                 <w:szCs w:val="21"/>
               </w:rPr>
-              <w:t>(2) 年度实际数量申报截止日期为次年2月15日，通过授权代表的在线门户提交。</w:t>
+              <w:t>(2) 年度实际数量申报截止日期为次年</w:t>
+            </w:r>
+            <w:r>
+              <w:rPr>
+                <w:rFonts w:hint="eastAsia" w:ascii="宋体" w:hAnsi="宋体" w:eastAsia="宋体" w:cs="宋体"/>
+                <w:b w:val="0"/>
+                <w:bCs w:val="0"/>
+                <w:sz w:val="21"/>
+                <w:szCs w:val="21"/>
+                <w:lang w:val="en-US" w:eastAsia="zh-CN"/>
+              </w:rPr>
+              <w:t>3</w:t>
+            </w:r>
+            <w:r>
+              <w:rPr>
+                <w:rFonts w:ascii="宋体" w:hAnsi="宋体" w:eastAsia="宋体" w:cs="宋体"/>
+                <w:b w:val="0"/>
+                <w:bCs w:val="0"/>
+                <w:sz w:val="21"/>
+                <w:szCs w:val="21"/>
+              </w:rPr>
+              <w:t>月1日，通过授权代表的在线门户提交。</w:t>
             </w:r>
           </w:p>
         </w:tc>
@@ -3822,7 +3908,7 @@
         </w:tblPrEx>
         <w:tc>
           <w:tcPr>
-            <w:tcW w:w="4513" w:type="dxa"/>
+            <w:tcW w:w="5018" w:type="dxa"/>
             <w:tcBorders>
               <w:top w:val="nil"/>
               <w:left w:val="nil"/>
@@ -3854,7 +3940,7 @@
         </w:tc>
         <w:tc>
           <w:tcPr>
-            <w:tcW w:w="5192" w:type="dxa"/>
+            <w:tcW w:w="4687" w:type="dxa"/>
             <w:tcBorders>
               <w:top w:val="nil"/>
               <w:left w:val="nil"/>
@@ -3904,7 +3990,7 @@
         </w:tblPrEx>
         <w:tc>
           <w:tcPr>
-            <w:tcW w:w="4513" w:type="dxa"/>
+            <w:tcW w:w="5018" w:type="dxa"/>
             <w:tcBorders>
               <w:top w:val="nil"/>
               <w:left w:val="nil"/>
@@ -3936,7 +4022,7 @@
         </w:tc>
         <w:tc>
           <w:tcPr>
-            <w:tcW w:w="5192" w:type="dxa"/>
+            <w:tcW w:w="4687" w:type="dxa"/>
             <w:tcBorders>
               <w:top w:val="nil"/>
               <w:left w:val="nil"/>
@@ -3986,7 +4072,7 @@
         </w:tblPrEx>
         <w:tc>
           <w:tcPr>
-            <w:tcW w:w="4513" w:type="dxa"/>
+            <w:tcW w:w="5018" w:type="dxa"/>
             <w:tcBorders>
               <w:top w:val="nil"/>
               <w:left w:val="nil"/>
@@ -4018,7 +4104,7 @@
         </w:tc>
         <w:tc>
           <w:tcPr>
-            <w:tcW w:w="5192" w:type="dxa"/>
+            <w:tcW w:w="4687" w:type="dxa"/>
             <w:tcBorders>
               <w:top w:val="nil"/>
               <w:left w:val="nil"/>
@@ -4089,7 +4175,7 @@
     </w:p>
     <w:tbl>
       <w:tblPr>
-        <w:tblStyle w:val="11"/>
+        <w:tblStyle w:val="12"/>
         <w:tblW w:w="9705" w:type="dxa"/>
         <w:tblInd w:w="0" w:type="dxa"/>
         <w:tblBorders>
@@ -4109,8 +4195,8 @@
         </w:tblCellMar>
       </w:tblPr>
       <w:tblGrid>
-        <w:gridCol w:w="4513"/>
-        <w:gridCol w:w="5192"/>
+        <w:gridCol w:w="5018"/>
+        <w:gridCol w:w="4687"/>
       </w:tblGrid>
       <w:tr>
         <w:tblPrEx>
@@ -4131,7 +4217,7 @@
         </w:tblPrEx>
         <w:tc>
           <w:tcPr>
-            <w:tcW w:w="4513" w:type="dxa"/>
+            <w:tcW w:w="5018" w:type="dxa"/>
             <w:tcBorders>
               <w:top w:val="nil"/>
               <w:left w:val="nil"/>
@@ -4163,7 +4249,7 @@
         </w:tc>
         <w:tc>
           <w:tcPr>
-            <w:tcW w:w="5192" w:type="dxa"/>
+            <w:tcW w:w="4687" w:type="dxa"/>
             <w:tcBorders>
               <w:top w:val="nil"/>
               <w:left w:val="nil"/>
@@ -4213,7 +4299,7 @@
         </w:tblPrEx>
         <w:tc>
           <w:tcPr>
-            <w:tcW w:w="4513" w:type="dxa"/>
+            <w:tcW w:w="5018" w:type="dxa"/>
             <w:tcBorders>
               <w:top w:val="nil"/>
               <w:left w:val="nil"/>
@@ -4245,7 +4331,7 @@
         </w:tc>
         <w:tc>
           <w:tcPr>
-            <w:tcW w:w="5192" w:type="dxa"/>
+            <w:tcW w:w="4687" w:type="dxa"/>
             <w:tcBorders>
               <w:top w:val="nil"/>
               <w:left w:val="nil"/>
@@ -4295,7 +4381,7 @@
         </w:tblPrEx>
         <w:tc>
           <w:tcPr>
-            <w:tcW w:w="4513" w:type="dxa"/>
+            <w:tcW w:w="5018" w:type="dxa"/>
             <w:tcBorders>
               <w:top w:val="nil"/>
               <w:left w:val="nil"/>
@@ -4327,7 +4413,7 @@
         </w:tc>
         <w:tc>
           <w:tcPr>
-            <w:tcW w:w="5192" w:type="dxa"/>
+            <w:tcW w:w="4687" w:type="dxa"/>
             <w:tcBorders>
               <w:top w:val="nil"/>
               <w:left w:val="nil"/>
@@ -4377,7 +4463,7 @@
         </w:tblPrEx>
         <w:tc>
           <w:tcPr>
-            <w:tcW w:w="4513" w:type="dxa"/>
+            <w:tcW w:w="5018" w:type="dxa"/>
             <w:tcBorders>
               <w:top w:val="nil"/>
               <w:left w:val="nil"/>
@@ -4409,7 +4495,7 @@
         </w:tc>
         <w:tc>
           <w:tcPr>
-            <w:tcW w:w="5192" w:type="dxa"/>
+            <w:tcW w:w="4687" w:type="dxa"/>
             <w:tcBorders>
               <w:top w:val="nil"/>
               <w:left w:val="nil"/>
@@ -4459,7 +4545,7 @@
         </w:tblPrEx>
         <w:tc>
           <w:tcPr>
-            <w:tcW w:w="4513" w:type="dxa"/>
+            <w:tcW w:w="5018" w:type="dxa"/>
             <w:tcBorders>
               <w:top w:val="nil"/>
               <w:left w:val="nil"/>
@@ -4491,7 +4577,7 @@
         </w:tc>
         <w:tc>
           <w:tcPr>
-            <w:tcW w:w="5192" w:type="dxa"/>
+            <w:tcW w:w="4687" w:type="dxa"/>
             <w:tcBorders>
               <w:top w:val="nil"/>
               <w:left w:val="nil"/>
@@ -4541,7 +4627,7 @@
         </w:tblPrEx>
         <w:tc>
           <w:tcPr>
-            <w:tcW w:w="4513" w:type="dxa"/>
+            <w:tcW w:w="5018" w:type="dxa"/>
             <w:tcBorders>
               <w:top w:val="nil"/>
               <w:left w:val="nil"/>
@@ -4573,7 +4659,7 @@
         </w:tc>
         <w:tc>
           <w:tcPr>
-            <w:tcW w:w="5192" w:type="dxa"/>
+            <w:tcW w:w="4687" w:type="dxa"/>
             <w:tcBorders>
               <w:top w:val="nil"/>
               <w:left w:val="nil"/>
@@ -4623,7 +4709,7 @@
         </w:tblPrEx>
         <w:tc>
           <w:tcPr>
-            <w:tcW w:w="4513" w:type="dxa"/>
+            <w:tcW w:w="5018" w:type="dxa"/>
             <w:tcBorders>
               <w:top w:val="nil"/>
               <w:left w:val="nil"/>
@@ -4655,7 +4741,7 @@
         </w:tc>
         <w:tc>
           <w:tcPr>
-            <w:tcW w:w="5192" w:type="dxa"/>
+            <w:tcW w:w="4687" w:type="dxa"/>
             <w:tcBorders>
               <w:top w:val="nil"/>
               <w:left w:val="nil"/>
@@ -4705,7 +4791,7 @@
         </w:tblPrEx>
         <w:tc>
           <w:tcPr>
-            <w:tcW w:w="4513" w:type="dxa"/>
+            <w:tcW w:w="5018" w:type="dxa"/>
             <w:tcBorders>
               <w:top w:val="nil"/>
               <w:left w:val="nil"/>
@@ -4737,7 +4823,7 @@
         </w:tc>
         <w:tc>
           <w:tcPr>
-            <w:tcW w:w="5192" w:type="dxa"/>
+            <w:tcW w:w="4687" w:type="dxa"/>
             <w:tcBorders>
               <w:top w:val="nil"/>
               <w:left w:val="nil"/>
@@ -4787,7 +4873,7 @@
         </w:tblPrEx>
         <w:tc>
           <w:tcPr>
-            <w:tcW w:w="4513" w:type="dxa"/>
+            <w:tcW w:w="5018" w:type="dxa"/>
             <w:tcBorders>
               <w:top w:val="nil"/>
               <w:left w:val="nil"/>
@@ -4819,7 +4905,7 @@
         </w:tc>
         <w:tc>
           <w:tcPr>
-            <w:tcW w:w="5192" w:type="dxa"/>
+            <w:tcW w:w="4687" w:type="dxa"/>
             <w:tcBorders>
               <w:top w:val="nil"/>
               <w:left w:val="nil"/>
@@ -4869,7 +4955,7 @@
         </w:tblPrEx>
         <w:tc>
           <w:tcPr>
-            <w:tcW w:w="4513" w:type="dxa"/>
+            <w:tcW w:w="5018" w:type="dxa"/>
             <w:tcBorders>
               <w:top w:val="nil"/>
               <w:left w:val="nil"/>
@@ -4901,7 +4987,7 @@
         </w:tc>
         <w:tc>
           <w:tcPr>
-            <w:tcW w:w="5192" w:type="dxa"/>
+            <w:tcW w:w="4687" w:type="dxa"/>
             <w:tcBorders>
               <w:top w:val="nil"/>
               <w:left w:val="nil"/>
@@ -4951,7 +5037,7 @@
         </w:tblPrEx>
         <w:tc>
           <w:tcPr>
-            <w:tcW w:w="4513" w:type="dxa"/>
+            <w:tcW w:w="5018" w:type="dxa"/>
             <w:tcBorders>
               <w:top w:val="nil"/>
               <w:left w:val="nil"/>
@@ -4983,7 +5069,7 @@
         </w:tc>
         <w:tc>
           <w:tcPr>
-            <w:tcW w:w="5192" w:type="dxa"/>
+            <w:tcW w:w="4687" w:type="dxa"/>
             <w:tcBorders>
               <w:top w:val="nil"/>
               <w:left w:val="nil"/>
@@ -5054,7 +5140,7 @@
     </w:p>
     <w:tbl>
       <w:tblPr>
-        <w:tblStyle w:val="11"/>
+        <w:tblStyle w:val="12"/>
         <w:tblW w:w="9705" w:type="dxa"/>
         <w:tblInd w:w="0" w:type="dxa"/>
         <w:tblBorders>
@@ -5074,8 +5160,8 @@
         </w:tblCellMar>
       </w:tblPr>
       <w:tblGrid>
-        <w:gridCol w:w="4513"/>
-        <w:gridCol w:w="5192"/>
+        <w:gridCol w:w="5018"/>
+        <w:gridCol w:w="4687"/>
       </w:tblGrid>
       <w:tr>
         <w:tblPrEx>
@@ -5087,16 +5173,10 @@
             <w:insideH w:val="single" w:color="auto" w:sz="4" w:space="0"/>
             <w:insideV w:val="single" w:color="auto" w:sz="4" w:space="0"/>
           </w:tblBorders>
-          <w:tblCellMar>
-            <w:top w:w="0" w:type="dxa"/>
-            <w:left w:w="10" w:type="dxa"/>
-            <w:bottom w:w="0" w:type="dxa"/>
-            <w:right w:w="10" w:type="dxa"/>
-          </w:tblCellMar>
         </w:tblPrEx>
         <w:tc>
           <w:tcPr>
-            <w:tcW w:w="4513" w:type="dxa"/>
+            <w:tcW w:w="5018" w:type="dxa"/>
             <w:tcBorders>
               <w:top w:val="nil"/>
               <w:left w:val="nil"/>
@@ -5128,7 +5208,7 @@
         </w:tc>
         <w:tc>
           <w:tcPr>
-            <w:tcW w:w="5192" w:type="dxa"/>
+            <w:tcW w:w="4687" w:type="dxa"/>
             <w:tcBorders>
               <w:top w:val="nil"/>
               <w:left w:val="nil"/>
@@ -5178,7 +5258,7 @@
         </w:tblPrEx>
         <w:tc>
           <w:tcPr>
-            <w:tcW w:w="4513" w:type="dxa"/>
+            <w:tcW w:w="5018" w:type="dxa"/>
             <w:tcBorders>
               <w:top w:val="nil"/>
               <w:left w:val="nil"/>
@@ -5210,7 +5290,7 @@
         </w:tc>
         <w:tc>
           <w:tcPr>
-            <w:tcW w:w="5192" w:type="dxa"/>
+            <w:tcW w:w="4687" w:type="dxa"/>
             <w:tcBorders>
               <w:top w:val="nil"/>
               <w:left w:val="nil"/>
@@ -5260,7 +5340,7 @@
         </w:tblPrEx>
         <w:tc>
           <w:tcPr>
-            <w:tcW w:w="4513" w:type="dxa"/>
+            <w:tcW w:w="5018" w:type="dxa"/>
             <w:tcBorders>
               <w:top w:val="nil"/>
               <w:left w:val="nil"/>
@@ -5292,7 +5372,7 @@
         </w:tc>
         <w:tc>
           <w:tcPr>
-            <w:tcW w:w="5192" w:type="dxa"/>
+            <w:tcW w:w="4687" w:type="dxa"/>
             <w:tcBorders>
               <w:top w:val="nil"/>
               <w:left w:val="nil"/>
@@ -5363,7 +5443,7 @@
     </w:p>
     <w:tbl>
       <w:tblPr>
-        <w:tblStyle w:val="11"/>
+        <w:tblStyle w:val="12"/>
         <w:tblW w:w="9705" w:type="dxa"/>
         <w:tblInd w:w="0" w:type="dxa"/>
         <w:tblBorders>
@@ -5383,8 +5463,8 @@
         </w:tblCellMar>
       </w:tblPr>
       <w:tblGrid>
-        <w:gridCol w:w="4513"/>
-        <w:gridCol w:w="5192"/>
+        <w:gridCol w:w="5018"/>
+        <w:gridCol w:w="4687"/>
       </w:tblGrid>
       <w:tr>
         <w:tblPrEx>
@@ -5405,7 +5485,7 @@
         </w:tblPrEx>
         <w:tc>
           <w:tcPr>
-            <w:tcW w:w="4513" w:type="dxa"/>
+            <w:tcW w:w="5018" w:type="dxa"/>
             <w:tcBorders>
               <w:top w:val="nil"/>
               <w:left w:val="nil"/>
@@ -5421,23 +5501,46 @@
           </w:tcPr>
           <w:p>
             <w:pPr>
-              <w:spacing w:before="20" w:after="20"/>
-            </w:pPr>
-            <w:r>
-              <w:rPr>
-                <w:rFonts w:ascii="Times New Roman" w:hAnsi="Times New Roman" w:eastAsia="Times New Roman" w:cs="Times New Roman"/>
-                <w:b w:val="0"/>
-                <w:bCs w:val="0"/>
-                <w:sz w:val="21"/>
-                <w:szCs w:val="21"/>
-              </w:rPr>
-              <w:t>(1) Der Kunde haftet uneingeschränkt für die Richtigkeit, Vollständigkeit und Rechtzeitigkeit der von ihm übermittelten Daten. Er stellt den Bevollmächtigten von sämtlichen Ansprüchen Dritter frei, die aus unrichtigen, unvollständigen oder verspäteten Angaben des Kunden entstehen. § 3 Abs. 6 Sätze 2 bis 5 gelten entsprechend.</w:t>
-            </w:r>
-          </w:p>
-        </w:tc>
-        <w:tc>
-          <w:tcPr>
-            <w:tcW w:w="5192" w:type="dxa"/>
+              <w:pStyle w:val="10"/>
+              <w:keepNext w:val="0"/>
+              <w:keepLines w:val="0"/>
+              <w:widowControl/>
+              <w:suppressLineNumbers w:val="0"/>
+              <w:pBdr>
+                <w:top w:val="none" w:color="auto" w:sz="0" w:space="0"/>
+                <w:left w:val="none" w:color="auto" w:sz="0" w:space="0"/>
+                <w:bottom w:val="none" w:color="auto" w:sz="0" w:space="0"/>
+                <w:right w:val="none" w:color="auto" w:sz="0" w:space="0"/>
+              </w:pBdr>
+              <w:wordWrap w:val="0"/>
+              <w:spacing w:before="0" w:beforeAutospacing="0" w:after="0" w:afterAutospacing="0" w:line="220" w:lineRule="atLeast"/>
+              <w:ind w:left="0" w:right="0" w:firstLine="0"/>
+            </w:pPr>
+            <w:r>
+              <w:rPr>
+                <w:rFonts w:ascii="Times New Roman" w:hAnsi="Times New Roman" w:eastAsia="Times New Roman" w:cs="Times New Roman"/>
+                <w:b w:val="0"/>
+                <w:bCs w:val="0"/>
+                <w:sz w:val="21"/>
+                <w:szCs w:val="21"/>
+              </w:rPr>
+              <w:t xml:space="preserve">(1) </w:t>
+            </w:r>
+            <w:r>
+              <w:rPr>
+                <w:rFonts w:hint="default" w:ascii="Times New Roman" w:hAnsi="Times New Roman" w:eastAsia="Times New Roman" w:cs="Times New Roman"/>
+                <w:b w:val="0"/>
+                <w:bCs w:val="0"/>
+                <w:sz w:val="21"/>
+                <w:szCs w:val="21"/>
+              </w:rPr>
+              <w:t>Der Kunde haftet uneingeschränkt für die Richtigkeit, Vollständigkeit und Rechtzeitigkeit der von ihm übermittelten Daten. Er stellt den Bevollmächtigten von sämtlichen Ansprüchen Dritter frei, die aus unrichtigen, unvollständigen oder verspäteten Angaben des Kunden entstehen. § 3 Abs. 6 gilt entsprechend.</w:t>
+            </w:r>
+          </w:p>
+        </w:tc>
+        <w:tc>
+          <w:tcPr>
+            <w:tcW w:w="4687" w:type="dxa"/>
             <w:tcBorders>
               <w:top w:val="nil"/>
               <w:left w:val="nil"/>
@@ -5453,9 +5556,20 @@
           </w:tcPr>
           <w:p>
             <w:pPr>
-              <w:spacing w:before="20" w:after="20"/>
-            </w:pPr>
-            <w:r>
+              <w:pStyle w:val="10"/>
+              <w:keepNext w:val="0"/>
+              <w:keepLines w:val="0"/>
+              <w:widowControl/>
+              <w:suppressLineNumbers w:val="0"/>
+              <w:pBdr>
+                <w:top w:val="none" w:color="auto" w:sz="0" w:space="0"/>
+                <w:left w:val="none" w:color="auto" w:sz="0" w:space="0"/>
+                <w:bottom w:val="none" w:color="auto" w:sz="0" w:space="0"/>
+                <w:right w:val="none" w:color="auto" w:sz="0" w:space="0"/>
+              </w:pBdr>
+              <w:wordWrap w:val="0"/>
+              <w:spacing w:before="0" w:beforeAutospacing="0" w:after="0" w:afterAutospacing="0" w:line="220" w:lineRule="atLeast"/>
+              <w:ind w:left="0" w:right="0" w:firstLine="0"/>
               <w:rPr>
                 <w:rFonts w:ascii="宋体" w:hAnsi="宋体" w:eastAsia="宋体" w:cs="宋体"/>
                 <w:b w:val="0"/>
@@ -5463,8 +5577,32 @@
                 <w:sz w:val="21"/>
                 <w:szCs w:val="21"/>
               </w:rPr>
-              <w:t>(1) 客户对其所提供数据的正确性、完整性和及时性承担无限责任。客户应赔偿授权代表因客户数据错误、不完整或延迟而产生的所有第三方索赔。第3条第6款第2至第5句相应适用。</w:t>
-            </w:r>
+            </w:pPr>
+            <w:r>
+              <w:rPr>
+                <w:rFonts w:ascii="宋体" w:hAnsi="宋体" w:eastAsia="宋体" w:cs="宋体"/>
+                <w:b w:val="0"/>
+                <w:bCs w:val="0"/>
+                <w:sz w:val="21"/>
+                <w:szCs w:val="21"/>
+              </w:rPr>
+              <w:t xml:space="preserve">(1) </w:t>
+            </w:r>
+            <w:r>
+              <w:rPr>
+                <w:rFonts w:hint="default" w:ascii="宋体" w:hAnsi="宋体" w:eastAsia="宋体" w:cs="宋体"/>
+                <w:b w:val="0"/>
+                <w:bCs w:val="0"/>
+                <w:sz w:val="21"/>
+                <w:szCs w:val="21"/>
+              </w:rPr>
+              <w:t>客户对其所提供数据的正确性、完整性和及时性承担无限责任。客户应赔偿授权代表因客户数据错误、不完整或延迟而产生的所有第三方索赔。第3条第6款相应适用。</w:t>
+            </w:r>
+          </w:p>
+          <w:p>
+            <w:pPr>
+              <w:spacing w:before="20" w:after="20"/>
+            </w:pPr>
           </w:p>
         </w:tc>
       </w:tr>
@@ -5487,7 +5625,7 @@
         </w:tblPrEx>
         <w:tc>
           <w:tcPr>
-            <w:tcW w:w="4513" w:type="dxa"/>
+            <w:tcW w:w="5018" w:type="dxa"/>
             <w:tcBorders>
               <w:top w:val="nil"/>
               <w:left w:val="nil"/>
@@ -5519,7 +5657,7 @@
         </w:tc>
         <w:tc>
           <w:tcPr>
-            <w:tcW w:w="5192" w:type="dxa"/>
+            <w:tcW w:w="4687" w:type="dxa"/>
             <w:tcBorders>
               <w:top w:val="nil"/>
               <w:left w:val="nil"/>
@@ -5569,7 +5707,7 @@
         </w:tblPrEx>
         <w:tc>
           <w:tcPr>
-            <w:tcW w:w="4513" w:type="dxa"/>
+            <w:tcW w:w="5018" w:type="dxa"/>
             <w:tcBorders>
               <w:top w:val="nil"/>
               <w:left w:val="nil"/>
@@ -5601,7 +5739,7 @@
         </w:tc>
         <w:tc>
           <w:tcPr>
-            <w:tcW w:w="5192" w:type="dxa"/>
+            <w:tcW w:w="4687" w:type="dxa"/>
             <w:tcBorders>
               <w:top w:val="nil"/>
               <w:left w:val="nil"/>
@@ -5651,7 +5789,7 @@
         </w:tblPrEx>
         <w:tc>
           <w:tcPr>
-            <w:tcW w:w="4513" w:type="dxa"/>
+            <w:tcW w:w="5018" w:type="dxa"/>
             <w:tcBorders>
               <w:top w:val="nil"/>
               <w:left w:val="nil"/>
@@ -5683,7 +5821,7 @@
         </w:tc>
         <w:tc>
           <w:tcPr>
-            <w:tcW w:w="5192" w:type="dxa"/>
+            <w:tcW w:w="4687" w:type="dxa"/>
             <w:tcBorders>
               <w:top w:val="nil"/>
               <w:left w:val="nil"/>
@@ -5733,7 +5871,7 @@
         </w:tblPrEx>
         <w:tc>
           <w:tcPr>
-            <w:tcW w:w="4513" w:type="dxa"/>
+            <w:tcW w:w="5018" w:type="dxa"/>
             <w:tcBorders>
               <w:top w:val="nil"/>
               <w:left w:val="nil"/>
@@ -5765,7 +5903,7 @@
         </w:tc>
         <w:tc>
           <w:tcPr>
-            <w:tcW w:w="5192" w:type="dxa"/>
+            <w:tcW w:w="4687" w:type="dxa"/>
             <w:tcBorders>
               <w:top w:val="nil"/>
               <w:left w:val="nil"/>
@@ -5836,7 +5974,7 @@
     </w:p>
     <w:tbl>
       <w:tblPr>
-        <w:tblStyle w:val="11"/>
+        <w:tblStyle w:val="12"/>
         <w:tblW w:w="9705" w:type="dxa"/>
         <w:tblInd w:w="0" w:type="dxa"/>
         <w:tblBorders>
@@ -5856,8 +5994,8 @@
         </w:tblCellMar>
       </w:tblPr>
       <w:tblGrid>
-        <w:gridCol w:w="4513"/>
-        <w:gridCol w:w="5192"/>
+        <w:gridCol w:w="5018"/>
+        <w:gridCol w:w="4687"/>
       </w:tblGrid>
       <w:tr>
         <w:tblPrEx>
@@ -5878,7 +6016,7 @@
         </w:tblPrEx>
         <w:tc>
           <w:tcPr>
-            <w:tcW w:w="4513" w:type="dxa"/>
+            <w:tcW w:w="5018" w:type="dxa"/>
             <w:tcBorders>
               <w:top w:val="nil"/>
               <w:left w:val="nil"/>
@@ -5910,7 +6048,7 @@
         </w:tc>
         <w:tc>
           <w:tcPr>
-            <w:tcW w:w="5192" w:type="dxa"/>
+            <w:tcW w:w="4687" w:type="dxa"/>
             <w:tcBorders>
               <w:top w:val="nil"/>
               <w:left w:val="nil"/>
@@ -5960,7 +6098,7 @@
         </w:tblPrEx>
         <w:tc>
           <w:tcPr>
-            <w:tcW w:w="4513" w:type="dxa"/>
+            <w:tcW w:w="5018" w:type="dxa"/>
             <w:tcBorders>
               <w:top w:val="nil"/>
               <w:left w:val="nil"/>
@@ -5986,13 +6124,34 @@
                 <w:sz w:val="21"/>
                 <w:szCs w:val="21"/>
               </w:rPr>
-              <w:t>(2) Der Vertrag verlängert sich automatisch um jeweils weitere 12 Monate, sofern er nicht mit einer Frist von 4 Wochen zum Ende der jeweiligen Vertragslaufzeit schriftlich gekündigt wird.</w:t>
-            </w:r>
-          </w:p>
-        </w:tc>
-        <w:tc>
-          <w:tcPr>
-            <w:tcW w:w="5192" w:type="dxa"/>
+              <w:t xml:space="preserve">(2) Der Vertrag verlängert sich automatisch um jeweils weitere 12 Monate, sofern er nicht mit einer Frist von </w:t>
+            </w:r>
+            <w:r>
+              <w:rPr>
+                <w:rFonts w:hint="eastAsia" w:eastAsia="宋体" w:cs="Times New Roman"/>
+                <w:b w:val="0"/>
+                <w:bCs w:val="0"/>
+                <w:sz w:val="21"/>
+                <w:szCs w:val="21"/>
+                <w:lang w:val="en-US" w:eastAsia="zh-CN"/>
+              </w:rPr>
+              <w:t>8</w:t>
+            </w:r>
+            <w:r>
+              <w:rPr>
+                <w:rFonts w:ascii="Times New Roman" w:hAnsi="Times New Roman" w:eastAsia="Times New Roman" w:cs="Times New Roman"/>
+                <w:b w:val="0"/>
+                <w:bCs w:val="0"/>
+                <w:sz w:val="21"/>
+                <w:szCs w:val="21"/>
+              </w:rPr>
+              <w:t xml:space="preserve"> Wochen zum Ende der jeweiligen Vertragslaufzeit schriftlich gekündigt wird.</w:t>
+            </w:r>
+          </w:p>
+        </w:tc>
+        <w:tc>
+          <w:tcPr>
+            <w:tcW w:w="4687" w:type="dxa"/>
             <w:tcBorders>
               <w:top w:val="nil"/>
               <w:left w:val="nil"/>
@@ -6018,7 +6177,28 @@
                 <w:sz w:val="21"/>
                 <w:szCs w:val="21"/>
               </w:rPr>
-              <w:t>(2) 合同自动续期12个月，除非任何一方在合同到期前4周书面通知终止。</w:t>
+              <w:t>(2) 合同自动续期12个月，除非任何一方在合同到期前</w:t>
+            </w:r>
+            <w:r>
+              <w:rPr>
+                <w:rFonts w:hint="eastAsia" w:ascii="宋体" w:hAnsi="宋体" w:eastAsia="宋体" w:cs="宋体"/>
+                <w:b w:val="0"/>
+                <w:bCs w:val="0"/>
+                <w:sz w:val="21"/>
+                <w:szCs w:val="21"/>
+                <w:lang w:val="en-US" w:eastAsia="zh-CN"/>
+              </w:rPr>
+              <w:t>8</w:t>
+            </w:r>
+            <w:r>
+              <w:rPr>
+                <w:rFonts w:ascii="宋体" w:hAnsi="宋体" w:eastAsia="宋体" w:cs="宋体"/>
+                <w:b w:val="0"/>
+                <w:bCs w:val="0"/>
+                <w:sz w:val="21"/>
+                <w:szCs w:val="21"/>
+              </w:rPr>
+              <w:t>周书面通知终止。</w:t>
             </w:r>
           </w:p>
         </w:tc>
@@ -6042,7 +6222,7 @@
         </w:tblPrEx>
         <w:tc>
           <w:tcPr>
-            <w:tcW w:w="4513" w:type="dxa"/>
+            <w:tcW w:w="5018" w:type="dxa"/>
             <w:tcBorders>
               <w:top w:val="nil"/>
               <w:left w:val="nil"/>
@@ -6074,7 +6254,7 @@
         </w:tc>
         <w:tc>
           <w:tcPr>
-            <w:tcW w:w="5192" w:type="dxa"/>
+            <w:tcW w:w="4687" w:type="dxa"/>
             <w:tcBorders>
               <w:top w:val="nil"/>
               <w:left w:val="nil"/>
@@ -6124,7 +6304,7 @@
         </w:tblPrEx>
         <w:tc>
           <w:tcPr>
-            <w:tcW w:w="4513" w:type="dxa"/>
+            <w:tcW w:w="5018" w:type="dxa"/>
             <w:tcBorders>
               <w:top w:val="nil"/>
               <w:left w:val="nil"/>
@@ -6140,23 +6320,92 @@
           </w:tcPr>
           <w:p>
             <w:pPr>
-              <w:spacing w:before="20" w:after="20"/>
-            </w:pPr>
-            <w:r>
-              <w:rPr>
-                <w:rFonts w:ascii="Times New Roman" w:hAnsi="Times New Roman" w:eastAsia="Times New Roman" w:cs="Times New Roman"/>
-                <w:b w:val="0"/>
-                <w:bCs w:val="0"/>
-                <w:sz w:val="21"/>
-                <w:szCs w:val="21"/>
-              </w:rPr>
-              <w:t>(4) Ein wichtiger Grund für den Bevollmächtigten liegt insbesondere vor bei: (a) Zahlungsverzug von mehr als 30 Tagen, (b) wiederholter Nichtvorlage der geschuldeten Verpackungsdaten, (c) Entzug des LUCID-Zugangs durch den Kunden.</w:t>
-            </w:r>
-          </w:p>
-        </w:tc>
-        <w:tc>
-          <w:tcPr>
-            <w:tcW w:w="5192" w:type="dxa"/>
+              <w:numPr>
+                <w:ilvl w:val="0"/>
+                <w:numId w:val="1"/>
+              </w:numPr>
+              <w:spacing w:before="20" w:after="20"/>
+              <w:rPr>
+                <w:rFonts w:ascii="Times New Roman" w:hAnsi="Times New Roman" w:eastAsia="Times New Roman" w:cs="Times New Roman"/>
+                <w:b w:val="0"/>
+                <w:bCs w:val="0"/>
+                <w:sz w:val="21"/>
+                <w:szCs w:val="21"/>
+              </w:rPr>
+            </w:pPr>
+            <w:r>
+              <w:rPr>
+                <w:rFonts w:ascii="Times New Roman" w:hAnsi="Times New Roman" w:eastAsia="Times New Roman" w:cs="Times New Roman"/>
+                <w:b w:val="0"/>
+                <w:bCs w:val="0"/>
+                <w:sz w:val="21"/>
+                <w:szCs w:val="21"/>
+              </w:rPr>
+              <w:t>Ein wichtiger Grund für den Bevollmächtigten liegt insbesondere vor bei:</w:t>
+            </w:r>
+          </w:p>
+          <w:p>
+            <w:pPr>
+              <w:numPr>
+                <w:numId w:val="0"/>
+              </w:numPr>
+              <w:spacing w:before="20" w:after="20"/>
+            </w:pPr>
+            <w:r>
+              <w:rPr>
+                <w:rFonts w:ascii="Times New Roman" w:hAnsi="Times New Roman" w:eastAsia="Times New Roman" w:cs="Times New Roman"/>
+                <w:b w:val="0"/>
+                <w:bCs w:val="0"/>
+                <w:sz w:val="21"/>
+                <w:szCs w:val="21"/>
+              </w:rPr>
+              <w:t>(a) Zahlungsverzug des Kunden von mehr als 30 Tagen,</w:t>
+            </w:r>
+            <w:r>
+              <w:rPr>
+                <w:rFonts w:hint="default" w:ascii="Times New Roman" w:hAnsi="Times New Roman" w:eastAsia="Times New Roman" w:cs="Times New Roman"/>
+                <w:b w:val="0"/>
+                <w:bCs w:val="0"/>
+                <w:sz w:val="21"/>
+                <w:szCs w:val="21"/>
+              </w:rPr>
+              <w:br w:type="textWrapping"/>
+            </w:r>
+            <w:r>
+              <w:rPr>
+                <w:rFonts w:hint="default" w:ascii="Times New Roman" w:hAnsi="Times New Roman" w:eastAsia="Times New Roman" w:cs="Times New Roman"/>
+                <w:b w:val="0"/>
+                <w:bCs w:val="0"/>
+                <w:sz w:val="21"/>
+                <w:szCs w:val="21"/>
+              </w:rPr>
+              <w:t>(b) wiederholte Nichtvorlage der geschuldeten Verpackungsdaten durch den Kunden,</w:t>
+            </w:r>
+            <w:r>
+              <w:rPr>
+                <w:rFonts w:hint="default" w:ascii="Times New Roman" w:hAnsi="Times New Roman" w:eastAsia="Times New Roman" w:cs="Times New Roman"/>
+                <w:b w:val="0"/>
+                <w:bCs w:val="0"/>
+                <w:sz w:val="21"/>
+                <w:szCs w:val="21"/>
+              </w:rPr>
+              <w:br w:type="textWrapping"/>
+            </w:r>
+            <w:r>
+              <w:rPr>
+                <w:rFonts w:hint="default" w:ascii="Times New Roman" w:hAnsi="Times New Roman" w:eastAsia="Times New Roman" w:cs="Times New Roman"/>
+                <w:b w:val="0"/>
+                <w:bCs w:val="0"/>
+                <w:sz w:val="21"/>
+                <w:szCs w:val="21"/>
+              </w:rPr>
+              <w:t>(c) Entzug des LUCID-Zugangs durch den Kunden.</w:t>
+            </w:r>
+          </w:p>
+        </w:tc>
+        <w:tc>
+          <w:tcPr>
+            <w:tcW w:w="4687" w:type="dxa"/>
             <w:tcBorders>
               <w:top w:val="nil"/>
               <w:left w:val="nil"/>
@@ -6173,8 +6422,6 @@
           <w:p>
             <w:pPr>
               <w:spacing w:before="20" w:after="20"/>
-            </w:pPr>
-            <w:r>
               <w:rPr>
                 <w:rFonts w:ascii="宋体" w:hAnsi="宋体" w:eastAsia="宋体" w:cs="宋体"/>
                 <w:b w:val="0"/>
@@ -6182,7 +6429,75 @@
                 <w:sz w:val="21"/>
                 <w:szCs w:val="21"/>
               </w:rPr>
-              <w:t>(4) 授权代表的重大终止事由特别包括：(a) 逾期付款超过30天，(b) 多次未提交应提交的包装数据，(c) 客户撤回LUCID访问权限。</w:t>
+            </w:pPr>
+            <w:r>
+              <w:rPr>
+                <w:rFonts w:ascii="宋体" w:hAnsi="宋体" w:eastAsia="宋体" w:cs="宋体"/>
+                <w:b w:val="0"/>
+                <w:bCs w:val="0"/>
+                <w:sz w:val="21"/>
+                <w:szCs w:val="21"/>
+              </w:rPr>
+              <w:t>(4) 授权代表的重大终止事由特别包括：</w:t>
+            </w:r>
+          </w:p>
+          <w:p>
+            <w:pPr>
+              <w:spacing w:before="20" w:after="20"/>
+              <w:rPr>
+                <w:rFonts w:hint="eastAsia" w:ascii="宋体" w:hAnsi="宋体" w:eastAsia="宋体" w:cs="宋体"/>
+                <w:b w:val="0"/>
+                <w:bCs w:val="0"/>
+                <w:sz w:val="21"/>
+                <w:szCs w:val="21"/>
+              </w:rPr>
+            </w:pPr>
+            <w:r>
+              <w:rPr>
+                <w:rFonts w:hint="eastAsia" w:ascii="宋体" w:hAnsi="宋体" w:eastAsia="宋体" w:cs="宋体"/>
+                <w:b w:val="0"/>
+                <w:bCs w:val="0"/>
+                <w:sz w:val="21"/>
+                <w:szCs w:val="21"/>
+              </w:rPr>
+              <w:t>(a) 客户逾期付款超过30天，</w:t>
+            </w:r>
+          </w:p>
+          <w:p>
+            <w:pPr>
+              <w:spacing w:before="20" w:after="20"/>
+              <w:rPr>
+                <w:rFonts w:hint="eastAsia" w:ascii="宋体" w:hAnsi="宋体" w:eastAsia="宋体" w:cs="宋体"/>
+                <w:b w:val="0"/>
+                <w:bCs w:val="0"/>
+                <w:sz w:val="21"/>
+                <w:szCs w:val="21"/>
+              </w:rPr>
+            </w:pPr>
+            <w:r>
+              <w:rPr>
+                <w:rFonts w:hint="eastAsia" w:ascii="宋体" w:hAnsi="宋体" w:eastAsia="宋体" w:cs="宋体"/>
+                <w:b w:val="0"/>
+                <w:bCs w:val="0"/>
+                <w:sz w:val="21"/>
+                <w:szCs w:val="21"/>
+              </w:rPr>
+              <w:t>(b) 客户多次未提交应提交的包装数据，</w:t>
+            </w:r>
+          </w:p>
+          <w:p>
+            <w:pPr>
+              <w:spacing w:before="20" w:after="20"/>
+            </w:pPr>
+            <w:r>
+              <w:rPr>
+                <w:rFonts w:hint="eastAsia" w:ascii="宋体" w:hAnsi="宋体" w:eastAsia="宋体" w:cs="宋体"/>
+                <w:b w:val="0"/>
+                <w:bCs w:val="0"/>
+                <w:sz w:val="21"/>
+                <w:szCs w:val="21"/>
+              </w:rPr>
+              <w:t>(c) 客户撤回LUCID访问权限</w:t>
             </w:r>
           </w:p>
         </w:tc>
@@ -6206,7 +6521,7 @@
         </w:tblPrEx>
         <w:tc>
           <w:tcPr>
-            <w:tcW w:w="4513" w:type="dxa"/>
+            <w:tcW w:w="5018" w:type="dxa"/>
             <w:tcBorders>
               <w:top w:val="nil"/>
               <w:left w:val="nil"/>
@@ -6238,7 +6553,7 @@
         </w:tc>
         <w:tc>
           <w:tcPr>
-            <w:tcW w:w="5192" w:type="dxa"/>
+            <w:tcW w:w="4687" w:type="dxa"/>
             <w:tcBorders>
               <w:top w:val="nil"/>
               <w:left w:val="nil"/>
@@ -6288,7 +6603,7 @@
         </w:tblPrEx>
         <w:tc>
           <w:tcPr>
-            <w:tcW w:w="4513" w:type="dxa"/>
+            <w:tcW w:w="5018" w:type="dxa"/>
             <w:tcBorders>
               <w:top w:val="nil"/>
               <w:left w:val="nil"/>
@@ -6320,7 +6635,7 @@
         </w:tc>
         <w:tc>
           <w:tcPr>
-            <w:tcW w:w="5192" w:type="dxa"/>
+            <w:tcW w:w="4687" w:type="dxa"/>
             <w:tcBorders>
               <w:top w:val="nil"/>
               <w:left w:val="nil"/>
@@ -6370,7 +6685,7 @@
         </w:tblPrEx>
         <w:tc>
           <w:tcPr>
-            <w:tcW w:w="4513" w:type="dxa"/>
+            <w:tcW w:w="5018" w:type="dxa"/>
             <w:tcBorders>
               <w:top w:val="nil"/>
               <w:left w:val="nil"/>
@@ -6402,7 +6717,7 @@
         </w:tc>
         <w:tc>
           <w:tcPr>
-            <w:tcW w:w="5192" w:type="dxa"/>
+            <w:tcW w:w="4687" w:type="dxa"/>
             <w:tcBorders>
               <w:top w:val="nil"/>
               <w:left w:val="nil"/>
@@ -6473,7 +6788,7 @@
     </w:p>
     <w:tbl>
       <w:tblPr>
-        <w:tblStyle w:val="11"/>
+        <w:tblStyle w:val="12"/>
         <w:tblW w:w="9705" w:type="dxa"/>
         <w:tblInd w:w="0" w:type="dxa"/>
         <w:tblBorders>
@@ -6493,8 +6808,8 @@
         </w:tblCellMar>
       </w:tblPr>
       <w:tblGrid>
-        <w:gridCol w:w="4513"/>
-        <w:gridCol w:w="5192"/>
+        <w:gridCol w:w="5018"/>
+        <w:gridCol w:w="4687"/>
       </w:tblGrid>
       <w:tr>
         <w:tblPrEx>
@@ -6515,7 +6830,7 @@
         </w:tblPrEx>
         <w:tc>
           <w:tcPr>
-            <w:tcW w:w="4513" w:type="dxa"/>
+            <w:tcW w:w="5018" w:type="dxa"/>
             <w:tcBorders>
               <w:top w:val="nil"/>
               <w:left w:val="nil"/>
@@ -6547,7 +6862,7 @@
         </w:tc>
         <w:tc>
           <w:tcPr>
-            <w:tcW w:w="5192" w:type="dxa"/>
+            <w:tcW w:w="4687" w:type="dxa"/>
             <w:tcBorders>
               <w:top w:val="nil"/>
               <w:left w:val="nil"/>
@@ -6597,7 +6912,7 @@
         </w:tblPrEx>
         <w:tc>
           <w:tcPr>
-            <w:tcW w:w="4513" w:type="dxa"/>
+            <w:tcW w:w="5018" w:type="dxa"/>
             <w:tcBorders>
               <w:top w:val="nil"/>
               <w:left w:val="nil"/>
@@ -6629,7 +6944,7 @@
         </w:tc>
         <w:tc>
           <w:tcPr>
-            <w:tcW w:w="5192" w:type="dxa"/>
+            <w:tcW w:w="4687" w:type="dxa"/>
             <w:tcBorders>
               <w:top w:val="nil"/>
               <w:left w:val="nil"/>
@@ -6647,6 +6962,7 @@
             <w:pPr>
               <w:spacing w:before="20" w:after="20"/>
             </w:pPr>
+            <w:bookmarkStart w:id="0" w:name="_GoBack"/>
             <w:r>
               <w:rPr>
                 <w:rFonts w:ascii="宋体" w:hAnsi="宋体" w:eastAsia="宋体" w:cs="宋体"/>
@@ -6657,6 +6973,7 @@
               </w:rPr>
               <w:t>(2) 向位于中华人民共和国的支付服务商FREDDY传输支付相关数据，基于欧盟委员会执行决定(EU) 2021/914项下的欧盟标准合同条款(SCC)，并补充基于客户根据GDPR第49条第1款(a)项的明确同意。客户特此被告知向未经充分性认定的第三国传输数据可能存在的风险。该同意可随时通过书面通知撤回。撤回将导致本合同在月底前一个月通知后终止。</w:t>
             </w:r>
+            <w:bookmarkEnd w:id="0"/>
           </w:p>
         </w:tc>
       </w:tr>
@@ -6700,7 +7017,7 @@
     </w:p>
     <w:tbl>
       <w:tblPr>
-        <w:tblStyle w:val="11"/>
+        <w:tblStyle w:val="12"/>
         <w:tblW w:w="9705" w:type="dxa"/>
         <w:tblInd w:w="0" w:type="dxa"/>
         <w:tblBorders>
@@ -6720,8 +7037,8 @@
         </w:tblCellMar>
       </w:tblPr>
       <w:tblGrid>
-        <w:gridCol w:w="4513"/>
-        <w:gridCol w:w="5192"/>
+        <w:gridCol w:w="5018"/>
+        <w:gridCol w:w="4687"/>
       </w:tblGrid>
       <w:tr>
         <w:tblPrEx>
@@ -6733,16 +7050,10 @@
             <w:insideH w:val="single" w:color="auto" w:sz="4" w:space="0"/>
             <w:insideV w:val="single" w:color="auto" w:sz="4" w:space="0"/>
           </w:tblBorders>
-          <w:tblCellMar>
-            <w:top w:w="0" w:type="dxa"/>
-            <w:left w:w="10" w:type="dxa"/>
-            <w:bottom w:w="0" w:type="dxa"/>
-            <w:right w:w="10" w:type="dxa"/>
-          </w:tblCellMar>
         </w:tblPrEx>
         <w:tc>
           <w:tcPr>
-            <w:tcW w:w="4513" w:type="dxa"/>
+            <w:tcW w:w="5018" w:type="dxa"/>
             <w:tcBorders>
               <w:top w:val="nil"/>
               <w:left w:val="nil"/>
@@ -6774,7 +7085,7 @@
         </w:tc>
         <w:tc>
           <w:tcPr>
-            <w:tcW w:w="5192" w:type="dxa"/>
+            <w:tcW w:w="4687" w:type="dxa"/>
             <w:tcBorders>
               <w:top w:val="nil"/>
               <w:left w:val="nil"/>
@@ -6824,7 +7135,7 @@
         </w:tblPrEx>
         <w:tc>
           <w:tcPr>
-            <w:tcW w:w="4513" w:type="dxa"/>
+            <w:tcW w:w="5018" w:type="dxa"/>
             <w:tcBorders>
               <w:top w:val="nil"/>
               <w:left w:val="nil"/>
@@ -6856,7 +7167,7 @@
         </w:tc>
         <w:tc>
           <w:tcPr>
-            <w:tcW w:w="5192" w:type="dxa"/>
+            <w:tcW w:w="4687" w:type="dxa"/>
             <w:tcBorders>
               <w:top w:val="nil"/>
               <w:left w:val="nil"/>
@@ -6906,7 +7217,7 @@
         </w:tblPrEx>
         <w:tc>
           <w:tcPr>
-            <w:tcW w:w="4513" w:type="dxa"/>
+            <w:tcW w:w="5018" w:type="dxa"/>
             <w:tcBorders>
               <w:top w:val="nil"/>
               <w:left w:val="nil"/>
@@ -6938,7 +7249,7 @@
         </w:tc>
         <w:tc>
           <w:tcPr>
-            <w:tcW w:w="5192" w:type="dxa"/>
+            <w:tcW w:w="4687" w:type="dxa"/>
             <w:tcBorders>
               <w:top w:val="nil"/>
               <w:left w:val="nil"/>
@@ -7009,7 +7320,7 @@
     </w:p>
     <w:tbl>
       <w:tblPr>
-        <w:tblStyle w:val="11"/>
+        <w:tblStyle w:val="12"/>
         <w:tblW w:w="9705" w:type="dxa"/>
         <w:tblInd w:w="0" w:type="dxa"/>
         <w:tblBorders>
@@ -7029,8 +7340,8 @@
         </w:tblCellMar>
       </w:tblPr>
       <w:tblGrid>
-        <w:gridCol w:w="4513"/>
-        <w:gridCol w:w="5192"/>
+        <w:gridCol w:w="5018"/>
+        <w:gridCol w:w="4687"/>
       </w:tblGrid>
       <w:tr>
         <w:tblPrEx>
@@ -7051,7 +7362,7 @@
         </w:tblPrEx>
         <w:tc>
           <w:tcPr>
-            <w:tcW w:w="4513" w:type="dxa"/>
+            <w:tcW w:w="5018" w:type="dxa"/>
             <w:tcBorders>
               <w:top w:val="nil"/>
               <w:left w:val="nil"/>
@@ -7083,7 +7394,7 @@
         </w:tc>
         <w:tc>
           <w:tcPr>
-            <w:tcW w:w="5192" w:type="dxa"/>
+            <w:tcW w:w="4687" w:type="dxa"/>
             <w:tcBorders>
               <w:top w:val="nil"/>
               <w:left w:val="nil"/>
@@ -7133,7 +7444,7 @@
         </w:tblPrEx>
         <w:tc>
           <w:tcPr>
-            <w:tcW w:w="4513" w:type="dxa"/>
+            <w:tcW w:w="5018" w:type="dxa"/>
             <w:tcBorders>
               <w:top w:val="nil"/>
               <w:left w:val="nil"/>
@@ -7165,7 +7476,7 @@
         </w:tc>
         <w:tc>
           <w:tcPr>
-            <w:tcW w:w="5192" w:type="dxa"/>
+            <w:tcW w:w="4687" w:type="dxa"/>
             <w:tcBorders>
               <w:top w:val="nil"/>
               <w:left w:val="nil"/>
@@ -7215,7 +7526,7 @@
         </w:tblPrEx>
         <w:tc>
           <w:tcPr>
-            <w:tcW w:w="4513" w:type="dxa"/>
+            <w:tcW w:w="5018" w:type="dxa"/>
             <w:tcBorders>
               <w:top w:val="nil"/>
               <w:left w:val="nil"/>
@@ -7247,7 +7558,7 @@
         </w:tc>
         <w:tc>
           <w:tcPr>
-            <w:tcW w:w="5192" w:type="dxa"/>
+            <w:tcW w:w="4687" w:type="dxa"/>
             <w:tcBorders>
               <w:top w:val="nil"/>
               <w:left w:val="nil"/>
@@ -7297,7 +7608,7 @@
         </w:tblPrEx>
         <w:tc>
           <w:tcPr>
-            <w:tcW w:w="4513" w:type="dxa"/>
+            <w:tcW w:w="5018" w:type="dxa"/>
             <w:tcBorders>
               <w:top w:val="nil"/>
               <w:left w:val="nil"/>
@@ -7329,7 +7640,7 @@
         </w:tc>
         <w:tc>
           <w:tcPr>
-            <w:tcW w:w="5192" w:type="dxa"/>
+            <w:tcW w:w="4687" w:type="dxa"/>
             <w:tcBorders>
               <w:top w:val="nil"/>
               <w:left w:val="nil"/>
@@ -7379,7 +7690,7 @@
         </w:tblPrEx>
         <w:tc>
           <w:tcPr>
-            <w:tcW w:w="4513" w:type="dxa"/>
+            <w:tcW w:w="5018" w:type="dxa"/>
             <w:tcBorders>
               <w:top w:val="nil"/>
               <w:left w:val="nil"/>
@@ -7411,7 +7722,7 @@
         </w:tc>
         <w:tc>
           <w:tcPr>
-            <w:tcW w:w="5192" w:type="dxa"/>
+            <w:tcW w:w="4687" w:type="dxa"/>
             <w:tcBorders>
               <w:top w:val="nil"/>
               <w:left w:val="nil"/>
@@ -7492,7 +7803,7 @@
     </w:p>
     <w:tbl>
       <w:tblPr>
-        <w:tblStyle w:val="11"/>
+        <w:tblStyle w:val="12"/>
         <w:tblW w:w="9705" w:type="dxa"/>
         <w:tblInd w:w="0" w:type="dxa"/>
         <w:tblBorders>
@@ -7512,8 +7823,8 @@
         </w:tblCellMar>
       </w:tblPr>
       <w:tblGrid>
-        <w:gridCol w:w="4513"/>
-        <w:gridCol w:w="5192"/>
+        <w:gridCol w:w="5027"/>
+        <w:gridCol w:w="4678"/>
       </w:tblGrid>
       <w:tr>
         <w:tblPrEx>
@@ -7534,7 +7845,7 @@
         </w:tblPrEx>
         <w:tc>
           <w:tcPr>
-            <w:tcW w:w="4513" w:type="dxa"/>
+            <w:tcW w:w="5027" w:type="dxa"/>
             <w:tcBorders>
               <w:top w:val="nil"/>
               <w:left w:val="nil"/>
@@ -7566,7 +7877,7 @@
         </w:tc>
         <w:tc>
           <w:tcPr>
-            <w:tcW w:w="5192" w:type="dxa"/>
+            <w:tcW w:w="4678" w:type="dxa"/>
             <w:tcBorders>
               <w:top w:val="nil"/>
               <w:left w:val="nil"/>
@@ -7616,7 +7927,7 @@
         </w:tblPrEx>
         <w:tc>
           <w:tcPr>
-            <w:tcW w:w="4513" w:type="dxa"/>
+            <w:tcW w:w="5027" w:type="dxa"/>
             <w:tcBorders>
               <w:top w:val="nil"/>
               <w:left w:val="nil"/>
@@ -7648,7 +7959,7 @@
         </w:tc>
         <w:tc>
           <w:tcPr>
-            <w:tcW w:w="5192" w:type="dxa"/>
+            <w:tcW w:w="4678" w:type="dxa"/>
             <w:tcBorders>
               <w:top w:val="nil"/>
               <w:left w:val="nil"/>
@@ -7698,7 +8009,7 @@
         </w:tblPrEx>
         <w:tc>
           <w:tcPr>
-            <w:tcW w:w="4513" w:type="dxa"/>
+            <w:tcW w:w="5027" w:type="dxa"/>
             <w:tcBorders>
               <w:top w:val="nil"/>
               <w:left w:val="nil"/>
@@ -7730,7 +8041,7 @@
         </w:tc>
         <w:tc>
           <w:tcPr>
-            <w:tcW w:w="5192" w:type="dxa"/>
+            <w:tcW w:w="4678" w:type="dxa"/>
             <w:tcBorders>
               <w:top w:val="nil"/>
               <w:left w:val="nil"/>
@@ -7780,7 +8091,7 @@
         </w:tblPrEx>
         <w:tc>
           <w:tcPr>
-            <w:tcW w:w="4513" w:type="dxa"/>
+            <w:tcW w:w="5027" w:type="dxa"/>
             <w:tcBorders>
               <w:top w:val="nil"/>
               <w:left w:val="nil"/>
@@ -7812,7 +8123,7 @@
         </w:tc>
         <w:tc>
           <w:tcPr>
-            <w:tcW w:w="5192" w:type="dxa"/>
+            <w:tcW w:w="4678" w:type="dxa"/>
             <w:tcBorders>
               <w:top w:val="nil"/>
               <w:left w:val="nil"/>
@@ -7862,7 +8173,7 @@
         </w:tblPrEx>
         <w:tc>
           <w:tcPr>
-            <w:tcW w:w="4513" w:type="dxa"/>
+            <w:tcW w:w="5027" w:type="dxa"/>
             <w:tcBorders>
               <w:top w:val="nil"/>
               <w:left w:val="nil"/>
@@ -7894,7 +8205,7 @@
         </w:tc>
         <w:tc>
           <w:tcPr>
-            <w:tcW w:w="5192" w:type="dxa"/>
+            <w:tcW w:w="4678" w:type="dxa"/>
             <w:tcBorders>
               <w:top w:val="nil"/>
               <w:left w:val="nil"/>
@@ -7944,7 +8255,7 @@
         </w:tblPrEx>
         <w:tc>
           <w:tcPr>
-            <w:tcW w:w="4513" w:type="dxa"/>
+            <w:tcW w:w="5027" w:type="dxa"/>
             <w:tcBorders>
               <w:top w:val="nil"/>
               <w:left w:val="nil"/>
@@ -7976,7 +8287,7 @@
         </w:tc>
         <w:tc>
           <w:tcPr>
-            <w:tcW w:w="5192" w:type="dxa"/>
+            <w:tcW w:w="4678" w:type="dxa"/>
             <w:tcBorders>
               <w:top w:val="nil"/>
               <w:left w:val="nil"/>
@@ -8026,7 +8337,7 @@
         </w:tblPrEx>
         <w:tc>
           <w:tcPr>
-            <w:tcW w:w="4513" w:type="dxa"/>
+            <w:tcW w:w="5027" w:type="dxa"/>
             <w:tcBorders>
               <w:top w:val="nil"/>
               <w:left w:val="nil"/>
@@ -8058,7 +8369,7 @@
         </w:tc>
         <w:tc>
           <w:tcPr>
-            <w:tcW w:w="5192" w:type="dxa"/>
+            <w:tcW w:w="4678" w:type="dxa"/>
             <w:tcBorders>
               <w:top w:val="nil"/>
               <w:left w:val="nil"/>
@@ -8108,7 +8419,7 @@
         </w:tblPrEx>
         <w:tc>
           <w:tcPr>
-            <w:tcW w:w="4513" w:type="dxa"/>
+            <w:tcW w:w="5027" w:type="dxa"/>
             <w:tcBorders>
               <w:top w:val="nil"/>
               <w:left w:val="nil"/>
@@ -8140,7 +8451,7 @@
         </w:tc>
         <w:tc>
           <w:tcPr>
-            <w:tcW w:w="5192" w:type="dxa"/>
+            <w:tcW w:w="4678" w:type="dxa"/>
             <w:tcBorders>
               <w:top w:val="nil"/>
               <w:left w:val="nil"/>
@@ -8221,7 +8532,7 @@
     </w:p>
     <w:tbl>
       <w:tblPr>
-        <w:tblStyle w:val="11"/>
+        <w:tblStyle w:val="12"/>
         <w:tblW w:w="9705" w:type="dxa"/>
         <w:tblInd w:w="0" w:type="dxa"/>
         <w:tblBorders>
@@ -8241,8 +8552,8 @@
         </w:tblCellMar>
       </w:tblPr>
       <w:tblGrid>
-        <w:gridCol w:w="4513"/>
-        <w:gridCol w:w="5192"/>
+        <w:gridCol w:w="5018"/>
+        <w:gridCol w:w="4687"/>
       </w:tblGrid>
       <w:tr>
         <w:tblPrEx>
@@ -8263,7 +8574,7 @@
         </w:tblPrEx>
         <w:tc>
           <w:tcPr>
-            <w:tcW w:w="4513" w:type="dxa"/>
+            <w:tcW w:w="5018" w:type="dxa"/>
             <w:tcBorders>
               <w:top w:val="nil"/>
               <w:left w:val="nil"/>
@@ -8295,7 +8606,7 @@
         </w:tc>
         <w:tc>
           <w:tcPr>
-            <w:tcW w:w="5192" w:type="dxa"/>
+            <w:tcW w:w="4687" w:type="dxa"/>
             <w:tcBorders>
               <w:top w:val="nil"/>
               <w:left w:val="nil"/>
@@ -8334,7 +8645,7 @@
     </w:p>
     <w:tbl>
       <w:tblPr>
-        <w:tblStyle w:val="11"/>
+        <w:tblStyle w:val="12"/>
         <w:tblW w:w="9755" w:type="dxa"/>
         <w:tblInd w:w="0" w:type="dxa"/>
         <w:tblBorders>
@@ -9097,7 +9408,7 @@
     </w:p>
     <w:tbl>
       <w:tblPr>
-        <w:tblStyle w:val="11"/>
+        <w:tblStyle w:val="12"/>
         <w:tblW w:w="9705" w:type="dxa"/>
         <w:tblInd w:w="0" w:type="dxa"/>
         <w:tblBorders>
@@ -9117,8 +9428,8 @@
         </w:tblCellMar>
       </w:tblPr>
       <w:tblGrid>
-        <w:gridCol w:w="4513"/>
-        <w:gridCol w:w="5192"/>
+        <w:gridCol w:w="5018"/>
+        <w:gridCol w:w="4687"/>
       </w:tblGrid>
       <w:tr>
         <w:tblPrEx>
@@ -9130,10 +9441,16 @@
             <w:insideH w:val="single" w:color="auto" w:sz="4" w:space="0"/>
             <w:insideV w:val="single" w:color="auto" w:sz="4" w:space="0"/>
           </w:tblBorders>
+          <w:tblCellMar>
+            <w:top w:w="0" w:type="dxa"/>
+            <w:left w:w="10" w:type="dxa"/>
+            <w:bottom w:w="0" w:type="dxa"/>
+            <w:right w:w="10" w:type="dxa"/>
+          </w:tblCellMar>
         </w:tblPrEx>
         <w:tc>
           <w:tcPr>
-            <w:tcW w:w="4513" w:type="dxa"/>
+            <w:tcW w:w="5018" w:type="dxa"/>
             <w:tcBorders>
               <w:top w:val="nil"/>
               <w:left w:val="nil"/>
@@ -9165,7 +9482,7 @@
         </w:tc>
         <w:tc>
           <w:tcPr>
-            <w:tcW w:w="5192" w:type="dxa"/>
+            <w:tcW w:w="4687" w:type="dxa"/>
             <w:tcBorders>
               <w:top w:val="nil"/>
               <w:left w:val="nil"/>
@@ -9246,7 +9563,7 @@
     </w:p>
     <w:tbl>
       <w:tblPr>
-        <w:tblStyle w:val="11"/>
+        <w:tblStyle w:val="12"/>
         <w:tblW w:w="9705" w:type="dxa"/>
         <w:tblInd w:w="0" w:type="dxa"/>
         <w:tblBorders>
@@ -9266,8 +9583,8 @@
         </w:tblCellMar>
       </w:tblPr>
       <w:tblGrid>
-        <w:gridCol w:w="4513"/>
-        <w:gridCol w:w="5192"/>
+        <w:gridCol w:w="5018"/>
+        <w:gridCol w:w="4687"/>
       </w:tblGrid>
       <w:tr>
         <w:tblPrEx>
@@ -9288,7 +9605,7 @@
         </w:tblPrEx>
         <w:tc>
           <w:tcPr>
-            <w:tcW w:w="4513" w:type="dxa"/>
+            <w:tcW w:w="5018" w:type="dxa"/>
             <w:tcBorders>
               <w:top w:val="nil"/>
               <w:left w:val="nil"/>
@@ -9320,7 +9637,7 @@
         </w:tc>
         <w:tc>
           <w:tcPr>
-            <w:tcW w:w="5192" w:type="dxa"/>
+            <w:tcW w:w="4687" w:type="dxa"/>
             <w:tcBorders>
               <w:top w:val="nil"/>
               <w:left w:val="nil"/>
@@ -9359,7 +9676,7 @@
     </w:p>
     <w:tbl>
       <w:tblPr>
-        <w:tblStyle w:val="11"/>
+        <w:tblStyle w:val="12"/>
         <w:tblW w:w="9755" w:type="dxa"/>
         <w:tblInd w:w="0" w:type="dxa"/>
         <w:tblBorders>
@@ -9370,7 +9687,7 @@
           <w:insideH w:val="single" w:color="auto" w:sz="4" w:space="0"/>
           <w:insideV w:val="single" w:color="auto" w:sz="4" w:space="0"/>
         </w:tblBorders>
-        <w:tblLayout w:type="autofit"/>
+        <w:tblLayout w:type="fixed"/>
         <w:tblCellMar>
           <w:top w:w="0" w:type="dxa"/>
           <w:left w:w="10" w:type="dxa"/>
@@ -9380,8 +9697,8 @@
       </w:tblPr>
       <w:tblGrid>
         <w:gridCol w:w="2400"/>
-        <w:gridCol w:w="1800"/>
-        <w:gridCol w:w="5555"/>
+        <w:gridCol w:w="1543"/>
+        <w:gridCol w:w="5812"/>
       </w:tblGrid>
       <w:tr>
         <w:tblPrEx>
@@ -9393,6 +9710,12 @@
             <w:insideH w:val="single" w:color="auto" w:sz="4" w:space="0"/>
             <w:insideV w:val="single" w:color="auto" w:sz="4" w:space="0"/>
           </w:tblBorders>
+          <w:tblCellMar>
+            <w:top w:w="0" w:type="dxa"/>
+            <w:left w:w="10" w:type="dxa"/>
+            <w:bottom w:w="0" w:type="dxa"/>
+            <w:right w:w="10" w:type="dxa"/>
+          </w:tblCellMar>
         </w:tblPrEx>
         <w:tc>
           <w:tcPr>
@@ -9424,7 +9747,7 @@
         </w:tc>
         <w:tc>
           <w:tcPr>
-            <w:tcW w:w="1800" w:type="dxa"/>
+            <w:tcW w:w="1543" w:type="dxa"/>
             <w:shd w:val="clear" w:color="auto" w:fill="1A237E"/>
             <w:tcMar>
               <w:top w:w="40" w:type="dxa"/>
@@ -9452,7 +9775,7 @@
         </w:tc>
         <w:tc>
           <w:tcPr>
-            <w:tcW w:w="5555" w:type="dxa"/>
+            <w:tcW w:w="5812" w:type="dxa"/>
             <w:shd w:val="clear" w:color="auto" w:fill="1A237E"/>
             <w:tcMar>
               <w:top w:w="40" w:type="dxa"/>
@@ -9521,7 +9844,7 @@
         </w:tc>
         <w:tc>
           <w:tcPr>
-            <w:tcW w:w="1800" w:type="dxa"/>
+            <w:tcW w:w="1543" w:type="dxa"/>
             <w:tcMar>
               <w:top w:w="40" w:type="dxa"/>
               <w:left w:w="50" w:type="dxa"/>
@@ -9544,7 +9867,7 @@
         </w:tc>
         <w:tc>
           <w:tcPr>
-            <w:tcW w:w="5555" w:type="dxa"/>
+            <w:tcW w:w="5812" w:type="dxa"/>
             <w:tcMar>
               <w:top w:w="40" w:type="dxa"/>
               <w:left w:w="50" w:type="dxa"/>
@@ -9609,7 +9932,7 @@
         </w:tc>
         <w:tc>
           <w:tcPr>
-            <w:tcW w:w="1800" w:type="dxa"/>
+            <w:tcW w:w="1543" w:type="dxa"/>
             <w:shd w:val="clear" w:color="auto" w:fill="E8EAF6"/>
             <w:tcMar>
               <w:top w:w="40" w:type="dxa"/>
@@ -9633,7 +9956,7 @@
         </w:tc>
         <w:tc>
           <w:tcPr>
-            <w:tcW w:w="5555" w:type="dxa"/>
+            <w:tcW w:w="5812" w:type="dxa"/>
             <w:shd w:val="clear" w:color="auto" w:fill="E8EAF6"/>
             <w:tcMar>
               <w:top w:w="40" w:type="dxa"/>
@@ -9698,7 +10021,7 @@
         </w:tc>
         <w:tc>
           <w:tcPr>
-            <w:tcW w:w="1800" w:type="dxa"/>
+            <w:tcW w:w="1543" w:type="dxa"/>
             <w:tcMar>
               <w:top w:w="40" w:type="dxa"/>
               <w:left w:w="50" w:type="dxa"/>
@@ -9721,7 +10044,7 @@
         </w:tc>
         <w:tc>
           <w:tcPr>
-            <w:tcW w:w="5555" w:type="dxa"/>
+            <w:tcW w:w="5812" w:type="dxa"/>
             <w:tcMar>
               <w:top w:w="40" w:type="dxa"/>
               <w:left w:w="50" w:type="dxa"/>
@@ -9751,7 +10074,7 @@
     </w:p>
     <w:tbl>
       <w:tblPr>
-        <w:tblStyle w:val="11"/>
+        <w:tblStyle w:val="12"/>
         <w:tblW w:w="9705" w:type="dxa"/>
         <w:tblInd w:w="0" w:type="dxa"/>
         <w:tblBorders>
@@ -9771,8 +10094,8 @@
         </w:tblCellMar>
       </w:tblPr>
       <w:tblGrid>
-        <w:gridCol w:w="4513"/>
-        <w:gridCol w:w="5192"/>
+        <w:gridCol w:w="5036"/>
+        <w:gridCol w:w="4669"/>
       </w:tblGrid>
       <w:tr>
         <w:tblPrEx>
@@ -9793,7 +10116,7 @@
         </w:tblPrEx>
         <w:tc>
           <w:tcPr>
-            <w:tcW w:w="4513" w:type="dxa"/>
+            <w:tcW w:w="5036" w:type="dxa"/>
             <w:tcBorders>
               <w:top w:val="nil"/>
               <w:left w:val="nil"/>
@@ -9825,7 +10148,7 @@
         </w:tc>
         <w:tc>
           <w:tcPr>
-            <w:tcW w:w="5192" w:type="dxa"/>
+            <w:tcW w:w="4669" w:type="dxa"/>
             <w:tcBorders>
               <w:top w:val="nil"/>
               <w:left w:val="nil"/>
@@ -9875,7 +10198,7 @@
         </w:tblPrEx>
         <w:tc>
           <w:tcPr>
-            <w:tcW w:w="4513" w:type="dxa"/>
+            <w:tcW w:w="5036" w:type="dxa"/>
             <w:tcBorders>
               <w:top w:val="nil"/>
               <w:left w:val="nil"/>
@@ -9907,7 +10230,7 @@
         </w:tc>
         <w:tc>
           <w:tcPr>
-            <w:tcW w:w="5192" w:type="dxa"/>
+            <w:tcW w:w="4669" w:type="dxa"/>
             <w:tcBorders>
               <w:top w:val="nil"/>
               <w:left w:val="nil"/>
@@ -9957,7 +10280,7 @@
         </w:tblPrEx>
         <w:tc>
           <w:tcPr>
-            <w:tcW w:w="4513" w:type="dxa"/>
+            <w:tcW w:w="5036" w:type="dxa"/>
             <w:tcBorders>
               <w:top w:val="nil"/>
               <w:left w:val="nil"/>
@@ -9989,7 +10312,7 @@
         </w:tc>
         <w:tc>
           <w:tcPr>
-            <w:tcW w:w="5192" w:type="dxa"/>
+            <w:tcW w:w="4669" w:type="dxa"/>
             <w:tcBorders>
               <w:top w:val="nil"/>
               <w:left w:val="nil"/>
@@ -10039,7 +10362,7 @@
         </w:tblPrEx>
         <w:tc>
           <w:tcPr>
-            <w:tcW w:w="4513" w:type="dxa"/>
+            <w:tcW w:w="5036" w:type="dxa"/>
             <w:tcBorders>
               <w:top w:val="nil"/>
               <w:left w:val="nil"/>
@@ -10071,7 +10394,7 @@
         </w:tc>
         <w:tc>
           <w:tcPr>
-            <w:tcW w:w="5192" w:type="dxa"/>
+            <w:tcW w:w="4669" w:type="dxa"/>
             <w:tcBorders>
               <w:top w:val="nil"/>
               <w:left w:val="nil"/>
@@ -10121,7 +10444,7 @@
         </w:tblPrEx>
         <w:tc>
           <w:tcPr>
-            <w:tcW w:w="4513" w:type="dxa"/>
+            <w:tcW w:w="5036" w:type="dxa"/>
             <w:tcBorders>
               <w:top w:val="nil"/>
               <w:left w:val="nil"/>
@@ -10153,7 +10476,7 @@
         </w:tc>
         <w:tc>
           <w:tcPr>
-            <w:tcW w:w="5192" w:type="dxa"/>
+            <w:tcW w:w="4669" w:type="dxa"/>
             <w:tcBorders>
               <w:top w:val="nil"/>
               <w:left w:val="nil"/>
@@ -10223,7 +10546,7 @@
     </w:p>
     <w:tbl>
       <w:tblPr>
-        <w:tblStyle w:val="11"/>
+        <w:tblStyle w:val="12"/>
         <w:tblW w:w="9745" w:type="dxa"/>
         <w:tblInd w:w="0" w:type="dxa"/>
         <w:tblBorders>
@@ -10359,7 +10682,7 @@
     </w:p>
     <w:tbl>
       <w:tblPr>
-        <w:tblStyle w:val="11"/>
+        <w:tblStyle w:val="12"/>
         <w:tblW w:w="9705" w:type="dxa"/>
         <w:tblInd w:w="0" w:type="dxa"/>
         <w:tblBorders>
@@ -10379,8 +10702,8 @@
         </w:tblCellMar>
       </w:tblPr>
       <w:tblGrid>
-        <w:gridCol w:w="4513"/>
-        <w:gridCol w:w="5192"/>
+        <w:gridCol w:w="5018"/>
+        <w:gridCol w:w="4687"/>
       </w:tblGrid>
       <w:tr>
         <w:tblPrEx>
@@ -10401,7 +10724,7 @@
         </w:tblPrEx>
         <w:tc>
           <w:tcPr>
-            <w:tcW w:w="4513" w:type="dxa"/>
+            <w:tcW w:w="5018" w:type="dxa"/>
             <w:tcBorders>
               <w:top w:val="nil"/>
               <w:left w:val="nil"/>
@@ -10433,7 +10756,7 @@
         </w:tc>
         <w:tc>
           <w:tcPr>
-            <w:tcW w:w="5192" w:type="dxa"/>
+            <w:tcW w:w="4687" w:type="dxa"/>
             <w:tcBorders>
               <w:top w:val="nil"/>
               <w:left w:val="nil"/>
@@ -10483,7 +10806,7 @@
         </w:tblPrEx>
         <w:tc>
           <w:tcPr>
-            <w:tcW w:w="4513" w:type="dxa"/>
+            <w:tcW w:w="5018" w:type="dxa"/>
             <w:tcBorders>
               <w:top w:val="nil"/>
               <w:left w:val="nil"/>
@@ -10515,7 +10838,7 @@
         </w:tc>
         <w:tc>
           <w:tcPr>
-            <w:tcW w:w="5192" w:type="dxa"/>
+            <w:tcW w:w="4687" w:type="dxa"/>
             <w:tcBorders>
               <w:top w:val="nil"/>
               <w:left w:val="nil"/>
@@ -10554,7 +10877,7 @@
     </w:p>
     <w:tbl>
       <w:tblPr>
-        <w:tblStyle w:val="11"/>
+        <w:tblStyle w:val="12"/>
         <w:tblW w:w="9705" w:type="dxa"/>
         <w:tblInd w:w="0" w:type="dxa"/>
         <w:tblBorders>
@@ -10574,8 +10897,8 @@
         </w:tblCellMar>
       </w:tblPr>
       <w:tblGrid>
-        <w:gridCol w:w="4513"/>
-        <w:gridCol w:w="5192"/>
+        <w:gridCol w:w="5018"/>
+        <w:gridCol w:w="4687"/>
       </w:tblGrid>
       <w:tr>
         <w:tblPrEx>
@@ -10596,7 +10919,7 @@
         </w:tblPrEx>
         <w:tc>
           <w:tcPr>
-            <w:tcW w:w="4513" w:type="dxa"/>
+            <w:tcW w:w="5018" w:type="dxa"/>
             <w:tcBorders>
               <w:top w:val="nil"/>
               <w:left w:val="nil"/>
@@ -10628,7 +10951,7 @@
         </w:tc>
         <w:tc>
           <w:tcPr>
-            <w:tcW w:w="5192" w:type="dxa"/>
+            <w:tcW w:w="4687" w:type="dxa"/>
             <w:tcBorders>
               <w:top w:val="nil"/>
               <w:left w:val="nil"/>
@@ -10678,7 +11001,7 @@
         </w:tblPrEx>
         <w:tc>
           <w:tcPr>
-            <w:tcW w:w="4513" w:type="dxa"/>
+            <w:tcW w:w="5018" w:type="dxa"/>
             <w:tcBorders>
               <w:top w:val="nil"/>
               <w:left w:val="nil"/>
@@ -10710,7 +11033,7 @@
         </w:tc>
         <w:tc>
           <w:tcPr>
-            <w:tcW w:w="5192" w:type="dxa"/>
+            <w:tcW w:w="4687" w:type="dxa"/>
             <w:tcBorders>
               <w:top w:val="nil"/>
               <w:left w:val="nil"/>
@@ -10749,7 +11072,7 @@
     </w:p>
     <w:tbl>
       <w:tblPr>
-        <w:tblStyle w:val="11"/>
+        <w:tblStyle w:val="12"/>
         <w:tblW w:w="9705" w:type="dxa"/>
         <w:tblInd w:w="0" w:type="dxa"/>
         <w:tblBorders>
@@ -10769,8 +11092,8 @@
         </w:tblCellMar>
       </w:tblPr>
       <w:tblGrid>
-        <w:gridCol w:w="4513"/>
-        <w:gridCol w:w="5192"/>
+        <w:gridCol w:w="5018"/>
+        <w:gridCol w:w="4687"/>
       </w:tblGrid>
       <w:tr>
         <w:tblPrEx>
@@ -10791,7 +11114,7 @@
         </w:tblPrEx>
         <w:tc>
           <w:tcPr>
-            <w:tcW w:w="4513" w:type="dxa"/>
+            <w:tcW w:w="5018" w:type="dxa"/>
             <w:tcBorders>
               <w:top w:val="nil"/>
               <w:left w:val="nil"/>
@@ -10823,7 +11146,7 @@
         </w:tc>
         <w:tc>
           <w:tcPr>
-            <w:tcW w:w="5192" w:type="dxa"/>
+            <w:tcW w:w="4687" w:type="dxa"/>
             <w:tcBorders>
               <w:top w:val="nil"/>
               <w:left w:val="nil"/>
@@ -10873,7 +11196,7 @@
         </w:tblPrEx>
         <w:tc>
           <w:tcPr>
-            <w:tcW w:w="4513" w:type="dxa"/>
+            <w:tcW w:w="5018" w:type="dxa"/>
             <w:tcBorders>
               <w:top w:val="nil"/>
               <w:left w:val="nil"/>
@@ -10905,7 +11228,7 @@
         </w:tc>
         <w:tc>
           <w:tcPr>
-            <w:tcW w:w="5192" w:type="dxa"/>
+            <w:tcW w:w="4687" w:type="dxa"/>
             <w:tcBorders>
               <w:top w:val="nil"/>
               <w:left w:val="nil"/>
@@ -11066,12 +11389,32 @@
 </w:hdr>
 </file>
 
+<file path=word/numbering.xml><?xml version="1.0" encoding="utf-8"?>
+<w:numbering xmlns:wpc="http://schemas.microsoft.com/office/word/2010/wordprocessingCanvas" xmlns:mc="http://schemas.openxmlformats.org/markup-compatibility/2006" xmlns:o="urn:schemas-microsoft-com:office:office" xmlns:r="http://schemas.openxmlformats.org/officeDocument/2006/relationships" xmlns:m="http://schemas.openxmlformats.org/officeDocument/2006/math" xmlns:v="urn:schemas-microsoft-com:vml" xmlns:wp14="http://schemas.microsoft.com/office/word/2010/wordprocessingDrawing" xmlns:wp="http://schemas.openxmlformats.org/drawingml/2006/wordprocessingDrawing" xmlns:w10="urn:schemas-microsoft-com:office:word" xmlns:w="http://schemas.openxmlformats.org/wordprocessingml/2006/main" xmlns:w14="http://schemas.microsoft.com/office/word/2010/wordml" xmlns:wpg="http://schemas.microsoft.com/office/word/2010/wordprocessingGroup" xmlns:wpi="http://schemas.microsoft.com/office/word/2010/wordprocessingInk" xmlns:wne="http://schemas.microsoft.com/office/word/2006/wordml" xmlns:wps="http://schemas.microsoft.com/office/word/2010/wordprocessingShape" xmlns:wpsCustomData="http://www.wps.cn/officeDocument/2013/wpsCustomData" mc:Ignorable="w14 wp14">
+  <w:abstractNum w:abstractNumId="0">
+    <w:nsid w:val="32B3AA26"/>
+    <w:multiLevelType w:val="singleLevel"/>
+    <w:tmpl w:val="32B3AA26"/>
+    <w:lvl w:ilvl="0" w:tentative="0">
+      <w:start w:val="4"/>
+      <w:numFmt w:val="decimal"/>
+      <w:suff w:val="space"/>
+      <w:lvlText w:val="(%1)"/>
+      <w:lvlJc w:val="left"/>
+    </w:lvl>
+  </w:abstractNum>
+  <w:num w:numId="1">
+    <w:abstractNumId w:val="0"/>
+  </w:num>
+</w:numbering>
+</file>
+
 <file path=word/styles.xml><?xml version="1.0" encoding="utf-8"?>
 <w:styles xmlns:mc="http://schemas.openxmlformats.org/markup-compatibility/2006" xmlns:o="urn:schemas-microsoft-com:office:office" xmlns:r="http://schemas.openxmlformats.org/officeDocument/2006/relationships" xmlns:m="http://schemas.openxmlformats.org/officeDocument/2006/math" xmlns:v="urn:schemas-microsoft-com:vml" xmlns:w="http://schemas.openxmlformats.org/wordprocessingml/2006/main" xmlns:w14="http://schemas.microsoft.com/office/word/2010/wordml" xmlns:w10="urn:schemas-microsoft-com:office:word" xmlns:sl="http://schemas.openxmlformats.org/schemaLibrary/2006/main" xmlns:wpsCustomData="http://www.wps.cn/officeDocument/2013/wpsCustomData" mc:Ignorable="w14">
   <w:docDefaults>
     <w:rPrDefault>
       <w:rPr>
-        <w:rFonts w:ascii="Times New Roman" w:hAnsi="Times New Roman" w:eastAsia="Times New Roman" w:cs="Times New Roman"/>
+        <w:rFonts w:ascii="Times New Roman" w:hAnsi="Times New Roman" w:eastAsia="宋体" w:cs="Times New Roman"/>
       </w:rPr>
     </w:rPrDefault>
     <w:pPrDefault/>
@@ -11415,12 +11758,12 @@
       <w:szCs w:val="21"/>
     </w:rPr>
   </w:style>
-  <w:style w:type="character" w:default="1" w:styleId="12">
+  <w:style w:type="character" w:default="1" w:styleId="13">
     <w:name w:val="Default Paragraph Font"/>
     <w:semiHidden/>
     <w:uiPriority w:val="0"/>
   </w:style>
-  <w:style w:type="table" w:default="1" w:styleId="11">
+  <w:style w:type="table" w:default="1" w:styleId="12">
     <w:name w:val="Normal Table"/>
     <w:semiHidden/>
     <w:uiPriority w:val="0"/>
@@ -11435,7 +11778,7 @@
   </w:style>
   <w:style w:type="paragraph" w:styleId="8">
     <w:name w:val="endnote text"/>
-    <w:link w:val="18"/>
+    <w:link w:val="19"/>
     <w:semiHidden/>
     <w:unhideWhenUsed/>
     <w:uiPriority w:val="99"/>
@@ -11450,7 +11793,7 @@
   </w:style>
   <w:style w:type="paragraph" w:styleId="9">
     <w:name w:val="footnote text"/>
-    <w:link w:val="17"/>
+    <w:link w:val="18"/>
     <w:semiHidden/>
     <w:unhideWhenUsed/>
     <w:uiPriority w:val="99"/>
@@ -11464,6 +11807,39 @@
     </w:rPr>
   </w:style>
   <w:style w:type="paragraph" w:styleId="10">
+    <w:name w:val="HTML Preformatted"/>
+    <w:basedOn w:val="1"/>
+    <w:uiPriority w:val="0"/>
+    <w:pPr>
+      <w:tabs>
+        <w:tab w:val="left" w:pos="916"/>
+        <w:tab w:val="left" w:pos="1832"/>
+        <w:tab w:val="left" w:pos="2748"/>
+        <w:tab w:val="left" w:pos="3664"/>
+        <w:tab w:val="left" w:pos="4580"/>
+        <w:tab w:val="left" w:pos="5496"/>
+        <w:tab w:val="left" w:pos="6412"/>
+        <w:tab w:val="left" w:pos="7328"/>
+        <w:tab w:val="left" w:pos="8244"/>
+        <w:tab w:val="left" w:pos="9160"/>
+        <w:tab w:val="left" w:pos="10076"/>
+        <w:tab w:val="left" w:pos="10992"/>
+        <w:tab w:val="left" w:pos="11908"/>
+        <w:tab w:val="left" w:pos="12824"/>
+        <w:tab w:val="left" w:pos="13740"/>
+        <w:tab w:val="left" w:pos="14656"/>
+      </w:tabs>
+      <w:jc w:val="left"/>
+    </w:pPr>
+    <w:rPr>
+      <w:rFonts w:hint="eastAsia" w:ascii="宋体" w:hAnsi="宋体" w:eastAsia="宋体" w:cs="宋体"/>
+      <w:kern w:val="0"/>
+      <w:sz w:val="24"/>
+      <w:szCs w:val="24"/>
+      <w:lang w:val="en-US" w:eastAsia="zh-CN" w:bidi="ar"/>
+    </w:rPr>
+  </w:style>
+  <w:style w:type="paragraph" w:styleId="11">
     <w:name w:val="Title"/>
     <w:qFormat/>
     <w:uiPriority w:val="0"/>
@@ -11473,7 +11849,7 @@
       <w:szCs w:val="56"/>
     </w:rPr>
   </w:style>
-  <w:style w:type="character" w:styleId="13">
+  <w:style w:type="character" w:styleId="14">
     <w:name w:val="endnote reference"/>
     <w:semiHidden/>
     <w:unhideWhenUsed/>
@@ -11482,7 +11858,7 @@
       <w:vertAlign w:val="superscript"/>
     </w:rPr>
   </w:style>
-  <w:style w:type="character" w:styleId="14">
+  <w:style w:type="character" w:styleId="15">
     <w:name w:val="Hyperlink"/>
     <w:unhideWhenUsed/>
     <w:uiPriority w:val="99"/>
@@ -11491,7 +11867,7 @@
       <w:u w:val="single"/>
     </w:rPr>
   </w:style>
-  <w:style w:type="character" w:styleId="15">
+  <w:style w:type="character" w:styleId="16">
     <w:name w:val="footnote reference"/>
     <w:semiHidden/>
     <w:unhideWhenUsed/>
@@ -11500,7 +11876,7 @@
       <w:vertAlign w:val="superscript"/>
     </w:rPr>
   </w:style>
-  <w:style w:type="paragraph" w:styleId="16">
+  <w:style w:type="paragraph" w:styleId="17">
     <w:name w:val="List Paragraph"/>
     <w:qFormat/>
     <w:uiPriority w:val="0"/>
@@ -11510,7 +11886,7 @@
       <w:szCs w:val="21"/>
     </w:rPr>
   </w:style>
-  <w:style w:type="character" w:customStyle="1" w:styleId="17">
+  <w:style w:type="character" w:customStyle="1" w:styleId="18">
     <w:name w:val="Footnote Text Char"/>
     <w:link w:val="9"/>
     <w:semiHidden/>
@@ -11521,7 +11897,7 @@
       <w:szCs w:val="20"/>
     </w:rPr>
   </w:style>
-  <w:style w:type="character" w:customStyle="1" w:styleId="18">
+  <w:style w:type="character" w:customStyle="1" w:styleId="19">
     <w:name w:val="Endnote Text Char"/>
     <w:link w:val="8"/>
     <w:semiHidden/>

</xml_diff>